<commit_message>
Open the user manual from a "?" toolbar button
- New "?" (User manual) button on the floating toolbar, in both the row and
  the column layout. It opens the PDF manual in the repository in a new
  browser tab: Traditional Chinese for Chinese UI languages, English
  otherwise (app_info::manual_url, unit-tested; opened through
  url_safety + open_web like every other link).
- The manual link in Settings > About is removed.
- Toolbar sizes grow by one button (row 500 px, column 576 px).
- Manuals rebuilt with the new button; screenshot hover is held during the
  capture so the real mouse cursor cannot undo it.

Co-Authored-By: Claude Opus 5.5 <noreply@anthropic.com>
</commit_message>
<xml_diff>
--- a/docs/manual/QRcode-tool-User-Manual-en.docx
+++ b/docs/manual/QRcode-tool-User-Manual-en.docx
@@ -8,7 +8,7 @@
           <w:noProof/>
         </w:rPr>
         <w:drawing>
-          <wp:anchor distT="0" distB="0" distL="0" distR="0" simplePos="0" relativeHeight="251657216" behindDoc="1" locked="0" layoutInCell="1" allowOverlap="1" wp14:anchorId="39440C07" wp14:editId="028E4E26">
+          <wp:anchor distT="0" distB="0" distL="0" distR="0" simplePos="0" relativeHeight="251657216" behindDoc="1" locked="0" layoutInCell="1" allowOverlap="1" wp14:anchorId="2A9B5B8B" wp14:editId="2513A18A">
             <wp:simplePos x="0" y="0"/>
             <wp:positionH relativeFrom="page">
               <wp:posOffset>0</wp:posOffset>
@@ -179,7 +179,7 @@
     <w:sdt>
       <w:sdtPr>
         <w:alias w:val="Contents"/>
-        <w:id w:val="-1140104249"/>
+        <w:id w:val="-1964106426"/>
       </w:sdtPr>
       <w:sdtEndPr>
         <w:rPr>
@@ -215,7 +215,7 @@
           <w:r>
             <w:fldChar w:fldCharType="separate"/>
           </w:r>
-          <w:hyperlink w:anchor="_Toc242656138" w:history="1">
+          <w:hyperlink w:anchor="_Toc242660013" w:history="1">
             <w:r>
               <w:rPr>
                 <w:rStyle w:val="a5"/>
@@ -239,7 +239,7 @@
               <w:rPr>
                 <w:noProof/>
               </w:rPr>
-              <w:instrText xml:space="preserve"> PAGEREF _Toc242656138 \h </w:instrText>
+              <w:instrText xml:space="preserve"> PAGEREF _Toc242660013 \h </w:instrText>
             </w:r>
             <w:r>
               <w:rPr>
@@ -282,7 +282,7 @@
               <w14:ligatures w14:val="standardContextual"/>
             </w:rPr>
           </w:pPr>
-          <w:hyperlink w:anchor="_Toc242656139" w:history="1">
+          <w:hyperlink w:anchor="_Toc242660014" w:history="1">
             <w:r>
               <w:rPr>
                 <w:rStyle w:val="a5"/>
@@ -306,7 +306,7 @@
               <w:rPr>
                 <w:noProof/>
               </w:rPr>
-              <w:instrText xml:space="preserve"> PAGEREF _Toc242656139 \h </w:instrText>
+              <w:instrText xml:space="preserve"> PAGEREF _Toc242660014 \h </w:instrText>
             </w:r>
             <w:r>
               <w:rPr>
@@ -349,7 +349,7 @@
               <w14:ligatures w14:val="standardContextual"/>
             </w:rPr>
           </w:pPr>
-          <w:hyperlink w:anchor="_Toc242656140" w:history="1">
+          <w:hyperlink w:anchor="_Toc242660015" w:history="1">
             <w:r>
               <w:rPr>
                 <w:rStyle w:val="a5"/>
@@ -373,7 +373,7 @@
               <w:rPr>
                 <w:noProof/>
               </w:rPr>
-              <w:instrText xml:space="preserve"> PAGEREF _Toc242656140 \h </w:instrText>
+              <w:instrText xml:space="preserve"> PAGEREF _Toc242660015 \h </w:instrText>
             </w:r>
             <w:r>
               <w:rPr>
@@ -416,7 +416,7 @@
               <w14:ligatures w14:val="standardContextual"/>
             </w:rPr>
           </w:pPr>
-          <w:hyperlink w:anchor="_Toc242656141" w:history="1">
+          <w:hyperlink w:anchor="_Toc242660016" w:history="1">
             <w:r>
               <w:rPr>
                 <w:rStyle w:val="a5"/>
@@ -440,7 +440,7 @@
               <w:rPr>
                 <w:noProof/>
               </w:rPr>
-              <w:instrText xml:space="preserve"> PAGEREF _Toc242656141 \h </w:instrText>
+              <w:instrText xml:space="preserve"> PAGEREF _Toc242660016 \h </w:instrText>
             </w:r>
             <w:r>
               <w:rPr>
@@ -483,7 +483,7 @@
               <w14:ligatures w14:val="standardContextual"/>
             </w:rPr>
           </w:pPr>
-          <w:hyperlink w:anchor="_Toc242656142" w:history="1">
+          <w:hyperlink w:anchor="_Toc242660017" w:history="1">
             <w:r>
               <w:rPr>
                 <w:rStyle w:val="a5"/>
@@ -507,7 +507,7 @@
               <w:rPr>
                 <w:noProof/>
               </w:rPr>
-              <w:instrText xml:space="preserve"> PAGEREF _Toc242656142 \h </w:instrText>
+              <w:instrText xml:space="preserve"> PAGEREF _Toc242660017 \h </w:instrText>
             </w:r>
             <w:r>
               <w:rPr>
@@ -552,7 +552,7 @@
               <w14:ligatures w14:val="standardContextual"/>
             </w:rPr>
           </w:pPr>
-          <w:hyperlink w:anchor="_Toc242656143" w:history="1">
+          <w:hyperlink w:anchor="_Toc242660018" w:history="1">
             <w:r>
               <w:rPr>
                 <w:rStyle w:val="a5"/>
@@ -576,7 +576,7 @@
               <w:rPr>
                 <w:noProof/>
               </w:rPr>
-              <w:instrText xml:space="preserve"> PAGEREF _Toc242656143 \h </w:instrText>
+              <w:instrText xml:space="preserve"> PAGEREF _Toc242660018 \h </w:instrText>
             </w:r>
             <w:r>
               <w:rPr>
@@ -619,7 +619,7 @@
               <w14:ligatures w14:val="standardContextual"/>
             </w:rPr>
           </w:pPr>
-          <w:hyperlink w:anchor="_Toc242656144" w:history="1">
+          <w:hyperlink w:anchor="_Toc242660019" w:history="1">
             <w:r>
               <w:rPr>
                 <w:rStyle w:val="a5"/>
@@ -643,7 +643,7 @@
               <w:rPr>
                 <w:noProof/>
               </w:rPr>
-              <w:instrText xml:space="preserve"> PAGEREF _Toc242656144 \h </w:instrText>
+              <w:instrText xml:space="preserve"> PAGEREF _Toc242660019 \h </w:instrText>
             </w:r>
             <w:r>
               <w:rPr>
@@ -686,7 +686,7 @@
               <w14:ligatures w14:val="standardContextual"/>
             </w:rPr>
           </w:pPr>
-          <w:hyperlink w:anchor="_Toc242656145" w:history="1">
+          <w:hyperlink w:anchor="_Toc242660020" w:history="1">
             <w:r>
               <w:rPr>
                 <w:rStyle w:val="a5"/>
@@ -710,7 +710,7 @@
               <w:rPr>
                 <w:noProof/>
               </w:rPr>
-              <w:instrText xml:space="preserve"> PAGEREF _Toc242656145 \h </w:instrText>
+              <w:instrText xml:space="preserve"> PAGEREF _Toc242660020 \h </w:instrText>
             </w:r>
             <w:r>
               <w:rPr>
@@ -753,7 +753,7 @@
               <w14:ligatures w14:val="standardContextual"/>
             </w:rPr>
           </w:pPr>
-          <w:hyperlink w:anchor="_Toc242656146" w:history="1">
+          <w:hyperlink w:anchor="_Toc242660021" w:history="1">
             <w:r>
               <w:rPr>
                 <w:rStyle w:val="a5"/>
@@ -777,7 +777,7 @@
               <w:rPr>
                 <w:noProof/>
               </w:rPr>
-              <w:instrText xml:space="preserve"> PAGEREF _Toc242656146 \h </w:instrText>
+              <w:instrText xml:space="preserve"> PAGEREF _Toc242660021 \h </w:instrText>
             </w:r>
             <w:r>
               <w:rPr>
@@ -820,7 +820,7 @@
               <w14:ligatures w14:val="standardContextual"/>
             </w:rPr>
           </w:pPr>
-          <w:hyperlink w:anchor="_Toc242656147" w:history="1">
+          <w:hyperlink w:anchor="_Toc242660022" w:history="1">
             <w:r>
               <w:rPr>
                 <w:rStyle w:val="a5"/>
@@ -844,7 +844,7 @@
               <w:rPr>
                 <w:noProof/>
               </w:rPr>
-              <w:instrText xml:space="preserve"> PAGEREF _Toc242656147 \h </w:instrText>
+              <w:instrText xml:space="preserve"> PAGEREF _Toc242660022 \h </w:instrText>
             </w:r>
             <w:r>
               <w:rPr>
@@ -887,7 +887,7 @@
               <w14:ligatures w14:val="standardContextual"/>
             </w:rPr>
           </w:pPr>
-          <w:hyperlink w:anchor="_Toc242656148" w:history="1">
+          <w:hyperlink w:anchor="_Toc242660023" w:history="1">
             <w:r>
               <w:rPr>
                 <w:rStyle w:val="a5"/>
@@ -911,7 +911,7 @@
               <w:rPr>
                 <w:noProof/>
               </w:rPr>
-              <w:instrText xml:space="preserve"> PAGEREF _Toc242656148 \h </w:instrText>
+              <w:instrText xml:space="preserve"> PAGEREF _Toc242660023 \h </w:instrText>
             </w:r>
             <w:r>
               <w:rPr>
@@ -956,7 +956,7 @@
               <w14:ligatures w14:val="standardContextual"/>
             </w:rPr>
           </w:pPr>
-          <w:hyperlink w:anchor="_Toc242656149" w:history="1">
+          <w:hyperlink w:anchor="_Toc242660024" w:history="1">
             <w:r>
               <w:rPr>
                 <w:rStyle w:val="a5"/>
@@ -980,7 +980,7 @@
               <w:rPr>
                 <w:noProof/>
               </w:rPr>
-              <w:instrText xml:space="preserve"> PAGEREF _Toc242656149 \h </w:instrText>
+              <w:instrText xml:space="preserve"> PAGEREF _Toc242660024 \h </w:instrText>
             </w:r>
             <w:r>
               <w:rPr>
@@ -1023,7 +1023,7 @@
               <w14:ligatures w14:val="standardContextual"/>
             </w:rPr>
           </w:pPr>
-          <w:hyperlink w:anchor="_Toc242656150" w:history="1">
+          <w:hyperlink w:anchor="_Toc242660025" w:history="1">
             <w:r>
               <w:rPr>
                 <w:rStyle w:val="a5"/>
@@ -1047,7 +1047,7 @@
               <w:rPr>
                 <w:noProof/>
               </w:rPr>
-              <w:instrText xml:space="preserve"> PAGEREF _Toc242656150 \h </w:instrText>
+              <w:instrText xml:space="preserve"> PAGEREF _Toc242660025 \h </w:instrText>
             </w:r>
             <w:r>
               <w:rPr>
@@ -1090,7 +1090,7 @@
               <w14:ligatures w14:val="standardContextual"/>
             </w:rPr>
           </w:pPr>
-          <w:hyperlink w:anchor="_Toc242656151" w:history="1">
+          <w:hyperlink w:anchor="_Toc242660026" w:history="1">
             <w:r>
               <w:rPr>
                 <w:rStyle w:val="a5"/>
@@ -1114,7 +1114,7 @@
               <w:rPr>
                 <w:noProof/>
               </w:rPr>
-              <w:instrText xml:space="preserve"> PAGEREF _Toc242656151 \h </w:instrText>
+              <w:instrText xml:space="preserve"> PAGEREF _Toc242660026 \h </w:instrText>
             </w:r>
             <w:r>
               <w:rPr>
@@ -1157,7 +1157,7 @@
               <w14:ligatures w14:val="standardContextual"/>
             </w:rPr>
           </w:pPr>
-          <w:hyperlink w:anchor="_Toc242656152" w:history="1">
+          <w:hyperlink w:anchor="_Toc242660027" w:history="1">
             <w:r>
               <w:rPr>
                 <w:rStyle w:val="a5"/>
@@ -1181,7 +1181,7 @@
               <w:rPr>
                 <w:noProof/>
               </w:rPr>
-              <w:instrText xml:space="preserve"> PAGEREF _Toc242656152 \h </w:instrText>
+              <w:instrText xml:space="preserve"> PAGEREF _Toc242660027 \h </w:instrText>
             </w:r>
             <w:r>
               <w:rPr>
@@ -1224,7 +1224,7 @@
               <w14:ligatures w14:val="standardContextual"/>
             </w:rPr>
           </w:pPr>
-          <w:hyperlink w:anchor="_Toc242656153" w:history="1">
+          <w:hyperlink w:anchor="_Toc242660028" w:history="1">
             <w:r>
               <w:rPr>
                 <w:rStyle w:val="a5"/>
@@ -1248,7 +1248,7 @@
               <w:rPr>
                 <w:noProof/>
               </w:rPr>
-              <w:instrText xml:space="preserve"> PAGEREF _Toc242656153 \h </w:instrText>
+              <w:instrText xml:space="preserve"> PAGEREF _Toc242660028 \h </w:instrText>
             </w:r>
             <w:r>
               <w:rPr>
@@ -1291,7 +1291,7 @@
               <w14:ligatures w14:val="standardContextual"/>
             </w:rPr>
           </w:pPr>
-          <w:hyperlink w:anchor="_Toc242656154" w:history="1">
+          <w:hyperlink w:anchor="_Toc242660029" w:history="1">
             <w:r>
               <w:rPr>
                 <w:rStyle w:val="a5"/>
@@ -1315,7 +1315,7 @@
               <w:rPr>
                 <w:noProof/>
               </w:rPr>
-              <w:instrText xml:space="preserve"> PAGEREF _Toc242656154 \h </w:instrText>
+              <w:instrText xml:space="preserve"> PAGEREF _Toc242660029 \h </w:instrText>
             </w:r>
             <w:r>
               <w:rPr>
@@ -1360,7 +1360,7 @@
               <w14:ligatures w14:val="standardContextual"/>
             </w:rPr>
           </w:pPr>
-          <w:hyperlink w:anchor="_Toc242656155" w:history="1">
+          <w:hyperlink w:anchor="_Toc242660030" w:history="1">
             <w:r>
               <w:rPr>
                 <w:rStyle w:val="a5"/>
@@ -1384,7 +1384,7 @@
               <w:rPr>
                 <w:noProof/>
               </w:rPr>
-              <w:instrText xml:space="preserve"> PAGEREF _Toc242656155 \h </w:instrText>
+              <w:instrText xml:space="preserve"> PAGEREF _Toc242660030 \h </w:instrText>
             </w:r>
             <w:r>
               <w:rPr>
@@ -1427,7 +1427,7 @@
               <w14:ligatures w14:val="standardContextual"/>
             </w:rPr>
           </w:pPr>
-          <w:hyperlink w:anchor="_Toc242656156" w:history="1">
+          <w:hyperlink w:anchor="_Toc242660031" w:history="1">
             <w:r>
               <w:rPr>
                 <w:rStyle w:val="a5"/>
@@ -1451,7 +1451,7 @@
               <w:rPr>
                 <w:noProof/>
               </w:rPr>
-              <w:instrText xml:space="preserve"> PAGEREF _Toc242656156 \h </w:instrText>
+              <w:instrText xml:space="preserve"> PAGEREF _Toc242660031 \h </w:instrText>
             </w:r>
             <w:r>
               <w:rPr>
@@ -1494,7 +1494,7 @@
               <w14:ligatures w14:val="standardContextual"/>
             </w:rPr>
           </w:pPr>
-          <w:hyperlink w:anchor="_Toc242656157" w:history="1">
+          <w:hyperlink w:anchor="_Toc242660032" w:history="1">
             <w:r>
               <w:rPr>
                 <w:rStyle w:val="a5"/>
@@ -1518,7 +1518,7 @@
               <w:rPr>
                 <w:noProof/>
               </w:rPr>
-              <w:instrText xml:space="preserve"> PAGEREF _Toc242656157 \h </w:instrText>
+              <w:instrText xml:space="preserve"> PAGEREF _Toc242660032 \h </w:instrText>
             </w:r>
             <w:r>
               <w:rPr>
@@ -1561,7 +1561,7 @@
               <w14:ligatures w14:val="standardContextual"/>
             </w:rPr>
           </w:pPr>
-          <w:hyperlink w:anchor="_Toc242656158" w:history="1">
+          <w:hyperlink w:anchor="_Toc242660033" w:history="1">
             <w:r>
               <w:rPr>
                 <w:rStyle w:val="a5"/>
@@ -1585,7 +1585,7 @@
               <w:rPr>
                 <w:noProof/>
               </w:rPr>
-              <w:instrText xml:space="preserve"> PAGEREF _Toc242656158 \h </w:instrText>
+              <w:instrText xml:space="preserve"> PAGEREF _Toc242660033 \h </w:instrText>
             </w:r>
             <w:r>
               <w:rPr>
@@ -1628,7 +1628,7 @@
               <w14:ligatures w14:val="standardContextual"/>
             </w:rPr>
           </w:pPr>
-          <w:hyperlink w:anchor="_Toc242656159" w:history="1">
+          <w:hyperlink w:anchor="_Toc242660034" w:history="1">
             <w:r>
               <w:rPr>
                 <w:rStyle w:val="a5"/>
@@ -1652,7 +1652,7 @@
               <w:rPr>
                 <w:noProof/>
               </w:rPr>
-              <w:instrText xml:space="preserve"> PAGEREF _Toc242656159 \h </w:instrText>
+              <w:instrText xml:space="preserve"> PAGEREF _Toc242660034 \h </w:instrText>
             </w:r>
             <w:r>
               <w:rPr>
@@ -1695,7 +1695,7 @@
               <w14:ligatures w14:val="standardContextual"/>
             </w:rPr>
           </w:pPr>
-          <w:hyperlink w:anchor="_Toc242656160" w:history="1">
+          <w:hyperlink w:anchor="_Toc242660035" w:history="1">
             <w:r>
               <w:rPr>
                 <w:rStyle w:val="a5"/>
@@ -1719,7 +1719,7 @@
               <w:rPr>
                 <w:noProof/>
               </w:rPr>
-              <w:instrText xml:space="preserve"> PAGEREF _Toc242656160 \h </w:instrText>
+              <w:instrText xml:space="preserve"> PAGEREF _Toc242660035 \h </w:instrText>
             </w:r>
             <w:r>
               <w:rPr>
@@ -1764,7 +1764,7 @@
               <w14:ligatures w14:val="standardContextual"/>
             </w:rPr>
           </w:pPr>
-          <w:hyperlink w:anchor="_Toc242656161" w:history="1">
+          <w:hyperlink w:anchor="_Toc242660036" w:history="1">
             <w:r>
               <w:rPr>
                 <w:rStyle w:val="a5"/>
@@ -1788,7 +1788,7 @@
               <w:rPr>
                 <w:noProof/>
               </w:rPr>
-              <w:instrText xml:space="preserve"> PAGEREF _Toc242656161 \h </w:instrText>
+              <w:instrText xml:space="preserve"> PAGEREF _Toc242660036 \h </w:instrText>
             </w:r>
             <w:r>
               <w:rPr>
@@ -1831,7 +1831,7 @@
               <w14:ligatures w14:val="standardContextual"/>
             </w:rPr>
           </w:pPr>
-          <w:hyperlink w:anchor="_Toc242656162" w:history="1">
+          <w:hyperlink w:anchor="_Toc242660037" w:history="1">
             <w:r>
               <w:rPr>
                 <w:rStyle w:val="a5"/>
@@ -1855,7 +1855,7 @@
               <w:rPr>
                 <w:noProof/>
               </w:rPr>
-              <w:instrText xml:space="preserve"> PAGEREF _Toc242656162 \h </w:instrText>
+              <w:instrText xml:space="preserve"> PAGEREF _Toc242660037 \h </w:instrText>
             </w:r>
             <w:r>
               <w:rPr>
@@ -1898,7 +1898,7 @@
               <w14:ligatures w14:val="standardContextual"/>
             </w:rPr>
           </w:pPr>
-          <w:hyperlink w:anchor="_Toc242656163" w:history="1">
+          <w:hyperlink w:anchor="_Toc242660038" w:history="1">
             <w:r>
               <w:rPr>
                 <w:rStyle w:val="a5"/>
@@ -1922,7 +1922,7 @@
               <w:rPr>
                 <w:noProof/>
               </w:rPr>
-              <w:instrText xml:space="preserve"> PAGEREF _Toc242656163 \h </w:instrText>
+              <w:instrText xml:space="preserve"> PAGEREF _Toc242660038 \h </w:instrText>
             </w:r>
             <w:r>
               <w:rPr>
@@ -1965,7 +1965,7 @@
               <w14:ligatures w14:val="standardContextual"/>
             </w:rPr>
           </w:pPr>
-          <w:hyperlink w:anchor="_Toc242656164" w:history="1">
+          <w:hyperlink w:anchor="_Toc242660039" w:history="1">
             <w:r>
               <w:rPr>
                 <w:rStyle w:val="a5"/>
@@ -1989,7 +1989,7 @@
               <w:rPr>
                 <w:noProof/>
               </w:rPr>
-              <w:instrText xml:space="preserve"> PAGEREF _Toc242656164 \h </w:instrText>
+              <w:instrText xml:space="preserve"> PAGEREF _Toc242660039 \h </w:instrText>
             </w:r>
             <w:r>
               <w:rPr>
@@ -2032,7 +2032,7 @@
               <w14:ligatures w14:val="standardContextual"/>
             </w:rPr>
           </w:pPr>
-          <w:hyperlink w:anchor="_Toc242656165" w:history="1">
+          <w:hyperlink w:anchor="_Toc242660040" w:history="1">
             <w:r>
               <w:rPr>
                 <w:rStyle w:val="a5"/>
@@ -2056,7 +2056,7 @@
               <w:rPr>
                 <w:noProof/>
               </w:rPr>
-              <w:instrText xml:space="preserve"> PAGEREF _Toc242656165 \h </w:instrText>
+              <w:instrText xml:space="preserve"> PAGEREF _Toc242660040 \h </w:instrText>
             </w:r>
             <w:r>
               <w:rPr>
@@ -2099,7 +2099,7 @@
               <w14:ligatures w14:val="standardContextual"/>
             </w:rPr>
           </w:pPr>
-          <w:hyperlink w:anchor="_Toc242656166" w:history="1">
+          <w:hyperlink w:anchor="_Toc242660041" w:history="1">
             <w:r>
               <w:rPr>
                 <w:rStyle w:val="a5"/>
@@ -2123,7 +2123,7 @@
               <w:rPr>
                 <w:noProof/>
               </w:rPr>
-              <w:instrText xml:space="preserve"> PAGEREF _Toc242656166 \h </w:instrText>
+              <w:instrText xml:space="preserve"> PAGEREF _Toc242660041 \h </w:instrText>
             </w:r>
             <w:r>
               <w:rPr>
@@ -2166,7 +2166,7 @@
               <w14:ligatures w14:val="standardContextual"/>
             </w:rPr>
           </w:pPr>
-          <w:hyperlink w:anchor="_Toc242656167" w:history="1">
+          <w:hyperlink w:anchor="_Toc242660042" w:history="1">
             <w:r>
               <w:rPr>
                 <w:rStyle w:val="a5"/>
@@ -2190,7 +2190,7 @@
               <w:rPr>
                 <w:noProof/>
               </w:rPr>
-              <w:instrText xml:space="preserve"> PAGEREF _Toc242656167 \h </w:instrText>
+              <w:instrText xml:space="preserve"> PAGEREF _Toc242660042 \h </w:instrText>
             </w:r>
             <w:r>
               <w:rPr>
@@ -2235,7 +2235,7 @@
               <w14:ligatures w14:val="standardContextual"/>
             </w:rPr>
           </w:pPr>
-          <w:hyperlink w:anchor="_Toc242656168" w:history="1">
+          <w:hyperlink w:anchor="_Toc242660043" w:history="1">
             <w:r>
               <w:rPr>
                 <w:rStyle w:val="a5"/>
@@ -2259,7 +2259,7 @@
               <w:rPr>
                 <w:noProof/>
               </w:rPr>
-              <w:instrText xml:space="preserve"> PAGEREF _Toc242656168 \h </w:instrText>
+              <w:instrText xml:space="preserve"> PAGEREF _Toc242660043 \h </w:instrText>
             </w:r>
             <w:r>
               <w:rPr>
@@ -2302,7 +2302,7 @@
               <w14:ligatures w14:val="standardContextual"/>
             </w:rPr>
           </w:pPr>
-          <w:hyperlink w:anchor="_Toc242656169" w:history="1">
+          <w:hyperlink w:anchor="_Toc242660044" w:history="1">
             <w:r>
               <w:rPr>
                 <w:rStyle w:val="a5"/>
@@ -2326,7 +2326,7 @@
               <w:rPr>
                 <w:noProof/>
               </w:rPr>
-              <w:instrText xml:space="preserve"> PAGEREF _Toc242656169 \h </w:instrText>
+              <w:instrText xml:space="preserve"> PAGEREF _Toc242660044 \h </w:instrText>
             </w:r>
             <w:r>
               <w:rPr>
@@ -2369,7 +2369,7 @@
               <w14:ligatures w14:val="standardContextual"/>
             </w:rPr>
           </w:pPr>
-          <w:hyperlink w:anchor="_Toc242656170" w:history="1">
+          <w:hyperlink w:anchor="_Toc242660045" w:history="1">
             <w:r>
               <w:rPr>
                 <w:rStyle w:val="a5"/>
@@ -2393,7 +2393,7 @@
               <w:rPr>
                 <w:noProof/>
               </w:rPr>
-              <w:instrText xml:space="preserve"> PAGEREF _Toc242656170 \h </w:instrText>
+              <w:instrText xml:space="preserve"> PAGEREF _Toc242660045 \h </w:instrText>
             </w:r>
             <w:r>
               <w:rPr>
@@ -2436,7 +2436,7 @@
               <w14:ligatures w14:val="standardContextual"/>
             </w:rPr>
           </w:pPr>
-          <w:hyperlink w:anchor="_Toc242656171" w:history="1">
+          <w:hyperlink w:anchor="_Toc242660046" w:history="1">
             <w:r>
               <w:rPr>
                 <w:rStyle w:val="a5"/>
@@ -2460,7 +2460,7 @@
               <w:rPr>
                 <w:noProof/>
               </w:rPr>
-              <w:instrText xml:space="preserve"> PAGEREF _Toc242656171 \h </w:instrText>
+              <w:instrText xml:space="preserve"> PAGEREF _Toc242660046 \h </w:instrText>
             </w:r>
             <w:r>
               <w:rPr>
@@ -2503,7 +2503,7 @@
               <w14:ligatures w14:val="standardContextual"/>
             </w:rPr>
           </w:pPr>
-          <w:hyperlink w:anchor="_Toc242656172" w:history="1">
+          <w:hyperlink w:anchor="_Toc242660047" w:history="1">
             <w:r>
               <w:rPr>
                 <w:rStyle w:val="a5"/>
@@ -2527,7 +2527,7 @@
               <w:rPr>
                 <w:noProof/>
               </w:rPr>
-              <w:instrText xml:space="preserve"> PAGEREF _Toc242656172 \h </w:instrText>
+              <w:instrText xml:space="preserve"> PAGEREF _Toc242660047 \h </w:instrText>
             </w:r>
             <w:r>
               <w:rPr>
@@ -2570,7 +2570,7 @@
               <w14:ligatures w14:val="standardContextual"/>
             </w:rPr>
           </w:pPr>
-          <w:hyperlink w:anchor="_Toc242656173" w:history="1">
+          <w:hyperlink w:anchor="_Toc242660048" w:history="1">
             <w:r>
               <w:rPr>
                 <w:rStyle w:val="a5"/>
@@ -2594,7 +2594,7 @@
               <w:rPr>
                 <w:noProof/>
               </w:rPr>
-              <w:instrText xml:space="preserve"> PAGEREF _Toc242656173 \h </w:instrText>
+              <w:instrText xml:space="preserve"> PAGEREF _Toc242660048 \h </w:instrText>
             </w:r>
             <w:r>
               <w:rPr>
@@ -2639,7 +2639,7 @@
               <w14:ligatures w14:val="standardContextual"/>
             </w:rPr>
           </w:pPr>
-          <w:hyperlink w:anchor="_Toc242656174" w:history="1">
+          <w:hyperlink w:anchor="_Toc242660049" w:history="1">
             <w:r>
               <w:rPr>
                 <w:rStyle w:val="a5"/>
@@ -2663,7 +2663,7 @@
               <w:rPr>
                 <w:noProof/>
               </w:rPr>
-              <w:instrText xml:space="preserve"> PAGEREF _Toc242656174 \h </w:instrText>
+              <w:instrText xml:space="preserve"> PAGEREF _Toc242660049 \h </w:instrText>
             </w:r>
             <w:r>
               <w:rPr>
@@ -2706,7 +2706,7 @@
               <w14:ligatures w14:val="standardContextual"/>
             </w:rPr>
           </w:pPr>
-          <w:hyperlink w:anchor="_Toc242656175" w:history="1">
+          <w:hyperlink w:anchor="_Toc242660050" w:history="1">
             <w:r>
               <w:rPr>
                 <w:rStyle w:val="a5"/>
@@ -2730,7 +2730,7 @@
               <w:rPr>
                 <w:noProof/>
               </w:rPr>
-              <w:instrText xml:space="preserve"> PAGEREF _Toc242656175 \h </w:instrText>
+              <w:instrText xml:space="preserve"> PAGEREF _Toc242660050 \h </w:instrText>
             </w:r>
             <w:r>
               <w:rPr>
@@ -2773,7 +2773,7 @@
               <w14:ligatures w14:val="standardContextual"/>
             </w:rPr>
           </w:pPr>
-          <w:hyperlink w:anchor="_Toc242656176" w:history="1">
+          <w:hyperlink w:anchor="_Toc242660051" w:history="1">
             <w:r>
               <w:rPr>
                 <w:rStyle w:val="a5"/>
@@ -2797,7 +2797,7 @@
               <w:rPr>
                 <w:noProof/>
               </w:rPr>
-              <w:instrText xml:space="preserve"> PAGEREF _Toc242656176 \h </w:instrText>
+              <w:instrText xml:space="preserve"> PAGEREF _Toc242660051 \h </w:instrText>
             </w:r>
             <w:r>
               <w:rPr>
@@ -2840,7 +2840,7 @@
               <w14:ligatures w14:val="standardContextual"/>
             </w:rPr>
           </w:pPr>
-          <w:hyperlink w:anchor="_Toc242656177" w:history="1">
+          <w:hyperlink w:anchor="_Toc242660052" w:history="1">
             <w:r>
               <w:rPr>
                 <w:rStyle w:val="a5"/>
@@ -2864,7 +2864,7 @@
               <w:rPr>
                 <w:noProof/>
               </w:rPr>
-              <w:instrText xml:space="preserve"> PAGEREF _Toc242656177 \h </w:instrText>
+              <w:instrText xml:space="preserve"> PAGEREF _Toc242660052 \h </w:instrText>
             </w:r>
             <w:r>
               <w:rPr>
@@ -2881,7 +2881,7 @@
               <w:rPr>
                 <w:noProof/>
               </w:rPr>
-              <w:t>21</w:t>
+              <w:t>22</w:t>
             </w:r>
             <w:r>
               <w:rPr>
@@ -2907,7 +2907,7 @@
               <w14:ligatures w14:val="standardContextual"/>
             </w:rPr>
           </w:pPr>
-          <w:hyperlink w:anchor="_Toc242656178" w:history="1">
+          <w:hyperlink w:anchor="_Toc242660053" w:history="1">
             <w:r>
               <w:rPr>
                 <w:rStyle w:val="a5"/>
@@ -2931,7 +2931,7 @@
               <w:rPr>
                 <w:noProof/>
               </w:rPr>
-              <w:instrText xml:space="preserve"> PAGEREF _Toc242656178 \h </w:instrText>
+              <w:instrText xml:space="preserve"> PAGEREF _Toc242660053 \h </w:instrText>
             </w:r>
             <w:r>
               <w:rPr>
@@ -2974,7 +2974,7 @@
               <w14:ligatures w14:val="standardContextual"/>
             </w:rPr>
           </w:pPr>
-          <w:hyperlink w:anchor="_Toc242656179" w:history="1">
+          <w:hyperlink w:anchor="_Toc242660054" w:history="1">
             <w:r>
               <w:rPr>
                 <w:rStyle w:val="a5"/>
@@ -2998,7 +2998,7 @@
               <w:rPr>
                 <w:noProof/>
               </w:rPr>
-              <w:instrText xml:space="preserve"> PAGEREF _Toc242656179 \h </w:instrText>
+              <w:instrText xml:space="preserve"> PAGEREF _Toc242660054 \h </w:instrText>
             </w:r>
             <w:r>
               <w:rPr>
@@ -3043,7 +3043,7 @@
               <w14:ligatures w14:val="standardContextual"/>
             </w:rPr>
           </w:pPr>
-          <w:hyperlink w:anchor="_Toc242656180" w:history="1">
+          <w:hyperlink w:anchor="_Toc242660055" w:history="1">
             <w:r>
               <w:rPr>
                 <w:rStyle w:val="a5"/>
@@ -3067,7 +3067,7 @@
               <w:rPr>
                 <w:noProof/>
               </w:rPr>
-              <w:instrText xml:space="preserve"> PAGEREF _Toc242656180 \h </w:instrText>
+              <w:instrText xml:space="preserve"> PAGEREF _Toc242660055 \h </w:instrText>
             </w:r>
             <w:r>
               <w:rPr>
@@ -3084,7 +3084,7 @@
               <w:rPr>
                 <w:noProof/>
               </w:rPr>
-              <w:t>23</w:t>
+              <w:t>24</w:t>
             </w:r>
             <w:r>
               <w:rPr>
@@ -3110,7 +3110,7 @@
               <w14:ligatures w14:val="standardContextual"/>
             </w:rPr>
           </w:pPr>
-          <w:hyperlink w:anchor="_Toc242656181" w:history="1">
+          <w:hyperlink w:anchor="_Toc242660056" w:history="1">
             <w:r>
               <w:rPr>
                 <w:rStyle w:val="a5"/>
@@ -3134,7 +3134,7 @@
               <w:rPr>
                 <w:noProof/>
               </w:rPr>
-              <w:instrText xml:space="preserve"> PAGEREF _Toc242656181 \h </w:instrText>
+              <w:instrText xml:space="preserve"> PAGEREF _Toc242660056 \h </w:instrText>
             </w:r>
             <w:r>
               <w:rPr>
@@ -3151,7 +3151,7 @@
               <w:rPr>
                 <w:noProof/>
               </w:rPr>
-              <w:t>23</w:t>
+              <w:t>24</w:t>
             </w:r>
             <w:r>
               <w:rPr>
@@ -3179,7 +3179,7 @@
               <w14:ligatures w14:val="standardContextual"/>
             </w:rPr>
           </w:pPr>
-          <w:hyperlink w:anchor="_Toc242656182" w:history="1">
+          <w:hyperlink w:anchor="_Toc242660057" w:history="1">
             <w:r>
               <w:rPr>
                 <w:rStyle w:val="a5"/>
@@ -3203,7 +3203,7 @@
               <w:rPr>
                 <w:noProof/>
               </w:rPr>
-              <w:instrText xml:space="preserve"> PAGEREF _Toc242656182 \h </w:instrText>
+              <w:instrText xml:space="preserve"> PAGEREF _Toc242660057 \h </w:instrText>
             </w:r>
             <w:r>
               <w:rPr>
@@ -3220,7 +3220,7 @@
               <w:rPr>
                 <w:noProof/>
               </w:rPr>
-              <w:t>25</w:t>
+              <w:t>26</w:t>
             </w:r>
             <w:r>
               <w:rPr>
@@ -3246,7 +3246,7 @@
               <w14:ligatures w14:val="standardContextual"/>
             </w:rPr>
           </w:pPr>
-          <w:hyperlink w:anchor="_Toc242656183" w:history="1">
+          <w:hyperlink w:anchor="_Toc242660058" w:history="1">
             <w:r>
               <w:rPr>
                 <w:rStyle w:val="a5"/>
@@ -3270,7 +3270,7 @@
               <w:rPr>
                 <w:noProof/>
               </w:rPr>
-              <w:instrText xml:space="preserve"> PAGEREF _Toc242656183 \h </w:instrText>
+              <w:instrText xml:space="preserve"> PAGEREF _Toc242660058 \h </w:instrText>
             </w:r>
             <w:r>
               <w:rPr>
@@ -3287,7 +3287,7 @@
               <w:rPr>
                 <w:noProof/>
               </w:rPr>
-              <w:t>25</w:t>
+              <w:t>26</w:t>
             </w:r>
             <w:r>
               <w:rPr>
@@ -3313,7 +3313,7 @@
               <w14:ligatures w14:val="standardContextual"/>
             </w:rPr>
           </w:pPr>
-          <w:hyperlink w:anchor="_Toc242656184" w:history="1">
+          <w:hyperlink w:anchor="_Toc242660059" w:history="1">
             <w:r>
               <w:rPr>
                 <w:rStyle w:val="a5"/>
@@ -3337,7 +3337,7 @@
               <w:rPr>
                 <w:noProof/>
               </w:rPr>
-              <w:instrText xml:space="preserve"> PAGEREF _Toc242656184 \h </w:instrText>
+              <w:instrText xml:space="preserve"> PAGEREF _Toc242660059 \h </w:instrText>
             </w:r>
             <w:r>
               <w:rPr>
@@ -3354,7 +3354,7 @@
               <w:rPr>
                 <w:noProof/>
               </w:rPr>
-              <w:t>26</w:t>
+              <w:t>27</w:t>
             </w:r>
             <w:r>
               <w:rPr>
@@ -3380,7 +3380,7 @@
               <w14:ligatures w14:val="standardContextual"/>
             </w:rPr>
           </w:pPr>
-          <w:hyperlink w:anchor="_Toc242656185" w:history="1">
+          <w:hyperlink w:anchor="_Toc242660060" w:history="1">
             <w:r>
               <w:rPr>
                 <w:rStyle w:val="a5"/>
@@ -3404,7 +3404,7 @@
               <w:rPr>
                 <w:noProof/>
               </w:rPr>
-              <w:instrText xml:space="preserve"> PAGEREF _Toc242656185 \h </w:instrText>
+              <w:instrText xml:space="preserve"> PAGEREF _Toc242660060 \h </w:instrText>
             </w:r>
             <w:r>
               <w:rPr>
@@ -3421,7 +3421,7 @@
               <w:rPr>
                 <w:noProof/>
               </w:rPr>
-              <w:t>27</w:t>
+              <w:t>28</w:t>
             </w:r>
             <w:r>
               <w:rPr>
@@ -3447,7 +3447,7 @@
               <w14:ligatures w14:val="standardContextual"/>
             </w:rPr>
           </w:pPr>
-          <w:hyperlink w:anchor="_Toc242656186" w:history="1">
+          <w:hyperlink w:anchor="_Toc242660061" w:history="1">
             <w:r>
               <w:rPr>
                 <w:rStyle w:val="a5"/>
@@ -3471,7 +3471,7 @@
               <w:rPr>
                 <w:noProof/>
               </w:rPr>
-              <w:instrText xml:space="preserve"> PAGEREF _Toc242656186 \h </w:instrText>
+              <w:instrText xml:space="preserve"> PAGEREF _Toc242660061 \h </w:instrText>
             </w:r>
             <w:r>
               <w:rPr>
@@ -3488,7 +3488,7 @@
               <w:rPr>
                 <w:noProof/>
               </w:rPr>
-              <w:t>28</w:t>
+              <w:t>29</w:t>
             </w:r>
             <w:r>
               <w:rPr>
@@ -3514,7 +3514,7 @@
               <w14:ligatures w14:val="standardContextual"/>
             </w:rPr>
           </w:pPr>
-          <w:hyperlink w:anchor="_Toc242656187" w:history="1">
+          <w:hyperlink w:anchor="_Toc242660062" w:history="1">
             <w:r>
               <w:rPr>
                 <w:rStyle w:val="a5"/>
@@ -3538,7 +3538,7 @@
               <w:rPr>
                 <w:noProof/>
               </w:rPr>
-              <w:instrText xml:space="preserve"> PAGEREF _Toc242656187 \h </w:instrText>
+              <w:instrText xml:space="preserve"> PAGEREF _Toc242660062 \h </w:instrText>
             </w:r>
             <w:r>
               <w:rPr>
@@ -3555,7 +3555,7 @@
               <w:rPr>
                 <w:noProof/>
               </w:rPr>
-              <w:t>29</w:t>
+              <w:t>30</w:t>
             </w:r>
             <w:r>
               <w:rPr>
@@ -3581,7 +3581,7 @@
               <w14:ligatures w14:val="standardContextual"/>
             </w:rPr>
           </w:pPr>
-          <w:hyperlink w:anchor="_Toc242656188" w:history="1">
+          <w:hyperlink w:anchor="_Toc242660063" w:history="1">
             <w:r>
               <w:rPr>
                 <w:rStyle w:val="a5"/>
@@ -3605,7 +3605,7 @@
               <w:rPr>
                 <w:noProof/>
               </w:rPr>
-              <w:instrText xml:space="preserve"> PAGEREF _Toc242656188 \h </w:instrText>
+              <w:instrText xml:space="preserve"> PAGEREF _Toc242660063 \h </w:instrText>
             </w:r>
             <w:r>
               <w:rPr>
@@ -3622,7 +3622,7 @@
               <w:rPr>
                 <w:noProof/>
               </w:rPr>
-              <w:t>30</w:t>
+              <w:t>31</w:t>
             </w:r>
             <w:r>
               <w:rPr>
@@ -3650,7 +3650,7 @@
               <w14:ligatures w14:val="standardContextual"/>
             </w:rPr>
           </w:pPr>
-          <w:hyperlink w:anchor="_Toc242656189" w:history="1">
+          <w:hyperlink w:anchor="_Toc242660064" w:history="1">
             <w:r>
               <w:rPr>
                 <w:rStyle w:val="a5"/>
@@ -3674,7 +3674,7 @@
               <w:rPr>
                 <w:noProof/>
               </w:rPr>
-              <w:instrText xml:space="preserve"> PAGEREF _Toc242656189 \h </w:instrText>
+              <w:instrText xml:space="preserve"> PAGEREF _Toc242660064 \h </w:instrText>
             </w:r>
             <w:r>
               <w:rPr>
@@ -3691,7 +3691,7 @@
               <w:rPr>
                 <w:noProof/>
               </w:rPr>
-              <w:t>31</w:t>
+              <w:t>32</w:t>
             </w:r>
             <w:r>
               <w:rPr>
@@ -3717,7 +3717,7 @@
               <w14:ligatures w14:val="standardContextual"/>
             </w:rPr>
           </w:pPr>
-          <w:hyperlink w:anchor="_Toc242656190" w:history="1">
+          <w:hyperlink w:anchor="_Toc242660065" w:history="1">
             <w:r>
               <w:rPr>
                 <w:rStyle w:val="a5"/>
@@ -3741,7 +3741,7 @@
               <w:rPr>
                 <w:noProof/>
               </w:rPr>
-              <w:instrText xml:space="preserve"> PAGEREF _Toc242656190 \h </w:instrText>
+              <w:instrText xml:space="preserve"> PAGEREF _Toc242660065 \h </w:instrText>
             </w:r>
             <w:r>
               <w:rPr>
@@ -3758,7 +3758,7 @@
               <w:rPr>
                 <w:noProof/>
               </w:rPr>
-              <w:t>31</w:t>
+              <w:t>32</w:t>
             </w:r>
             <w:r>
               <w:rPr>
@@ -3784,7 +3784,7 @@
               <w14:ligatures w14:val="standardContextual"/>
             </w:rPr>
           </w:pPr>
-          <w:hyperlink w:anchor="_Toc242656191" w:history="1">
+          <w:hyperlink w:anchor="_Toc242660066" w:history="1">
             <w:r>
               <w:rPr>
                 <w:rStyle w:val="a5"/>
@@ -3808,7 +3808,7 @@
               <w:rPr>
                 <w:noProof/>
               </w:rPr>
-              <w:instrText xml:space="preserve"> PAGEREF _Toc242656191 \h </w:instrText>
+              <w:instrText xml:space="preserve"> PAGEREF _Toc242660066 \h </w:instrText>
             </w:r>
             <w:r>
               <w:rPr>
@@ -3825,7 +3825,7 @@
               <w:rPr>
                 <w:noProof/>
               </w:rPr>
-              <w:t>31</w:t>
+              <w:t>32</w:t>
             </w:r>
             <w:r>
               <w:rPr>
@@ -3851,7 +3851,7 @@
               <w14:ligatures w14:val="standardContextual"/>
             </w:rPr>
           </w:pPr>
-          <w:hyperlink w:anchor="_Toc242656192" w:history="1">
+          <w:hyperlink w:anchor="_Toc242660067" w:history="1">
             <w:r>
               <w:rPr>
                 <w:rStyle w:val="a5"/>
@@ -3875,7 +3875,7 @@
               <w:rPr>
                 <w:noProof/>
               </w:rPr>
-              <w:instrText xml:space="preserve"> PAGEREF _Toc242656192 \h </w:instrText>
+              <w:instrText xml:space="preserve"> PAGEREF _Toc242660067 \h </w:instrText>
             </w:r>
             <w:r>
               <w:rPr>
@@ -3892,7 +3892,7 @@
               <w:rPr>
                 <w:noProof/>
               </w:rPr>
-              <w:t>31</w:t>
+              <w:t>32</w:t>
             </w:r>
             <w:r>
               <w:rPr>
@@ -3918,7 +3918,7 @@
               <w14:ligatures w14:val="standardContextual"/>
             </w:rPr>
           </w:pPr>
-          <w:hyperlink w:anchor="_Toc242656193" w:history="1">
+          <w:hyperlink w:anchor="_Toc242660068" w:history="1">
             <w:r>
               <w:rPr>
                 <w:rStyle w:val="a5"/>
@@ -3942,7 +3942,7 @@
               <w:rPr>
                 <w:noProof/>
               </w:rPr>
-              <w:instrText xml:space="preserve"> PAGEREF _Toc242656193 \h </w:instrText>
+              <w:instrText xml:space="preserve"> PAGEREF _Toc242660068 \h </w:instrText>
             </w:r>
             <w:r>
               <w:rPr>
@@ -3959,7 +3959,7 @@
               <w:rPr>
                 <w:noProof/>
               </w:rPr>
-              <w:t>32</w:t>
+              <w:t>33</w:t>
             </w:r>
             <w:r>
               <w:rPr>
@@ -3987,7 +3987,7 @@
               <w14:ligatures w14:val="standardContextual"/>
             </w:rPr>
           </w:pPr>
-          <w:hyperlink w:anchor="_Toc242656194" w:history="1">
+          <w:hyperlink w:anchor="_Toc242660069" w:history="1">
             <w:r>
               <w:rPr>
                 <w:rStyle w:val="a5"/>
@@ -4011,7 +4011,7 @@
               <w:rPr>
                 <w:noProof/>
               </w:rPr>
-              <w:instrText xml:space="preserve"> PAGEREF _Toc242656194 \h </w:instrText>
+              <w:instrText xml:space="preserve"> PAGEREF _Toc242660069 \h </w:instrText>
             </w:r>
             <w:r>
               <w:rPr>
@@ -4028,7 +4028,7 @@
               <w:rPr>
                 <w:noProof/>
               </w:rPr>
-              <w:t>33</w:t>
+              <w:t>34</w:t>
             </w:r>
             <w:r>
               <w:rPr>
@@ -4056,7 +4056,7 @@
               <w14:ligatures w14:val="standardContextual"/>
             </w:rPr>
           </w:pPr>
-          <w:hyperlink w:anchor="_Toc242656195" w:history="1">
+          <w:hyperlink w:anchor="_Toc242660070" w:history="1">
             <w:r>
               <w:rPr>
                 <w:rStyle w:val="a5"/>
@@ -4080,7 +4080,7 @@
               <w:rPr>
                 <w:noProof/>
               </w:rPr>
-              <w:instrText xml:space="preserve"> PAGEREF _Toc242656195 \h </w:instrText>
+              <w:instrText xml:space="preserve"> PAGEREF _Toc242660070 \h </w:instrText>
             </w:r>
             <w:r>
               <w:rPr>
@@ -4097,7 +4097,7 @@
               <w:rPr>
                 <w:noProof/>
               </w:rPr>
-              <w:t>35</w:t>
+              <w:t>36</w:t>
             </w:r>
             <w:r>
               <w:rPr>
@@ -4125,7 +4125,7 @@
               <w14:ligatures w14:val="standardContextual"/>
             </w:rPr>
           </w:pPr>
-          <w:hyperlink w:anchor="_Toc242656196" w:history="1">
+          <w:hyperlink w:anchor="_Toc242660071" w:history="1">
             <w:r>
               <w:rPr>
                 <w:rStyle w:val="a5"/>
@@ -4149,7 +4149,7 @@
               <w:rPr>
                 <w:noProof/>
               </w:rPr>
-              <w:instrText xml:space="preserve"> PAGEREF _Toc242656196 \h </w:instrText>
+              <w:instrText xml:space="preserve"> PAGEREF _Toc242660071 \h </w:instrText>
             </w:r>
             <w:r>
               <w:rPr>
@@ -4166,7 +4166,7 @@
               <w:rPr>
                 <w:noProof/>
               </w:rPr>
-              <w:t>36</w:t>
+              <w:t>37</w:t>
             </w:r>
             <w:r>
               <w:rPr>
@@ -4218,7 +4218,7 @@
       <w:pPr>
         <w:pStyle w:val="1"/>
       </w:pPr>
-      <w:bookmarkStart w:id="0" w:name="_Toc242656138"/>
+      <w:bookmarkStart w:id="0" w:name="_Toc242660013"/>
       <w:r>
         <w:t>1 Introducing QRcode tool</w:t>
       </w:r>
@@ -4265,7 +4265,7 @@
       <w:pPr>
         <w:pStyle w:val="2"/>
       </w:pPr>
-      <w:bookmarkStart w:id="1" w:name="_Toc242656139"/>
+      <w:bookmarkStart w:id="1" w:name="_Toc242660014"/>
       <w:r>
         <w:t>1.1 Main features</w:t>
       </w:r>
@@ -4287,7 +4287,7 @@
           <w:left w:w="10" w:type="dxa"/>
           <w:right w:w="10" w:type="dxa"/>
         </w:tblCellMar>
-        <w:tblLook w:val="0000" w:firstRow="0" w:lastRow="0" w:firstColumn="0" w:lastColumn="0" w:noHBand="0" w:noVBand="0"/>
+        <w:tblLook w:val="04A0" w:firstRow="1" w:lastRow="0" w:firstColumn="1" w:lastColumn="0" w:noHBand="0" w:noVBand="1"/>
       </w:tblPr>
       <w:tblGrid>
         <w:gridCol w:w="2417"/>
@@ -4902,7 +4902,7 @@
       <w:pPr>
         <w:pStyle w:val="2"/>
       </w:pPr>
-      <w:bookmarkStart w:id="2" w:name="_Toc242656140"/>
+      <w:bookmarkStart w:id="2" w:name="_Toc242660015"/>
       <w:r>
         <w:lastRenderedPageBreak/>
         <w:t>1.2 System requirements</w:t>
@@ -4925,7 +4925,7 @@
           <w:left w:w="10" w:type="dxa"/>
           <w:right w:w="10" w:type="dxa"/>
         </w:tblCellMar>
-        <w:tblLook w:val="0000" w:firstRow="0" w:lastRow="0" w:firstColumn="0" w:lastColumn="0" w:noHBand="0" w:noVBand="0"/>
+        <w:tblLook w:val="04A0" w:firstRow="1" w:lastRow="0" w:firstColumn="1" w:lastColumn="0" w:noHBand="0" w:noVBand="1"/>
       </w:tblPr>
       <w:tblGrid>
         <w:gridCol w:w="2789"/>
@@ -5245,7 +5245,7 @@
       <w:pPr>
         <w:pStyle w:val="2"/>
       </w:pPr>
-      <w:bookmarkStart w:id="3" w:name="_Toc242656141"/>
+      <w:bookmarkStart w:id="3" w:name="_Toc242660016"/>
       <w:r>
         <w:t>1.3 Privacy and safety principles</w:t>
       </w:r>
@@ -5346,7 +5346,7 @@
       <w:pPr>
         <w:pStyle w:val="2"/>
       </w:pPr>
-      <w:bookmarkStart w:id="4" w:name="_Toc242656142"/>
+      <w:bookmarkStart w:id="4" w:name="_Toc242660017"/>
       <w:r>
         <w:t>1.4 Conventions used in this manual</w:t>
       </w:r>
@@ -5537,7 +5537,7 @@
       <w:pPr>
         <w:pStyle w:val="1"/>
       </w:pPr>
-      <w:bookmarkStart w:id="5" w:name="_Toc242656143"/>
+      <w:bookmarkStart w:id="5" w:name="_Toc242660018"/>
       <w:r>
         <w:t>2 Installation and first start</w:t>
       </w:r>
@@ -5547,7 +5547,7 @@
       <w:pPr>
         <w:pStyle w:val="2"/>
       </w:pPr>
-      <w:bookmarkStart w:id="6" w:name="_Toc242656144"/>
+      <w:bookmarkStart w:id="6" w:name="_Toc242660019"/>
       <w:r>
         <w:t>2.1 Download and install (Windows)</w:t>
       </w:r>
@@ -5651,7 +5651,7 @@
           <w:left w:w="10" w:type="dxa"/>
           <w:right w:w="10" w:type="dxa"/>
         </w:tblCellMar>
-        <w:tblLook w:val="0000" w:firstRow="0" w:lastRow="0" w:firstColumn="0" w:lastColumn="0" w:noHBand="0" w:noVBand="0"/>
+        <w:tblLook w:val="04A0" w:firstRow="1" w:lastRow="0" w:firstColumn="1" w:lastColumn="0" w:noHBand="0" w:noVBand="1"/>
       </w:tblPr>
       <w:tblGrid>
         <w:gridCol w:w="9298"/>
@@ -5718,7 +5718,7 @@
       <w:pPr>
         <w:pStyle w:val="2"/>
       </w:pPr>
-      <w:bookmarkStart w:id="7" w:name="_Toc242656145"/>
+      <w:bookmarkStart w:id="7" w:name="_Toc242660020"/>
       <w:r>
         <w:t>2.2 If Windows shows “Windows protected your PC”</w:t>
       </w:r>
@@ -5813,7 +5813,7 @@
           <w:left w:w="10" w:type="dxa"/>
           <w:right w:w="10" w:type="dxa"/>
         </w:tblCellMar>
-        <w:tblLook w:val="0000" w:firstRow="0" w:lastRow="0" w:firstColumn="0" w:lastColumn="0" w:noHBand="0" w:noVBand="0"/>
+        <w:tblLook w:val="04A0" w:firstRow="1" w:lastRow="0" w:firstColumn="1" w:lastColumn="0" w:noHBand="0" w:noVBand="1"/>
       </w:tblPr>
       <w:tblGrid>
         <w:gridCol w:w="9298"/>
@@ -5862,7 +5862,7 @@
       <w:pPr>
         <w:pStyle w:val="2"/>
       </w:pPr>
-      <w:bookmarkStart w:id="8" w:name="_Toc242656146"/>
+      <w:bookmarkStart w:id="8" w:name="_Toc242660021"/>
       <w:r>
         <w:t>2.3 macOS and Linux</w:t>
       </w:r>
@@ -5956,7 +5956,7 @@
       <w:pPr>
         <w:pStyle w:val="2"/>
       </w:pPr>
-      <w:bookmarkStart w:id="9" w:name="_Toc242656147"/>
+      <w:bookmarkStart w:id="9" w:name="_Toc242660022"/>
       <w:r>
         <w:t>2.4 The welcome screen</w:t>
       </w:r>
@@ -5978,10 +5978,10 @@
           <w:noProof/>
         </w:rPr>
         <w:drawing>
-          <wp:inline distT="0" distB="0" distL="0" distR="0" wp14:anchorId="2858C6F9" wp14:editId="70D5F6A7">
+          <wp:inline distT="0" distB="0" distL="0" distR="0" wp14:anchorId="7D28EDE4" wp14:editId="263B3DF7">
             <wp:extent cx="3962400" cy="4352925"/>
             <wp:effectExtent l="0" t="0" r="0" b="0"/>
-            <wp:docPr id="1221895283" name="welcome" descr="welcome" title="welcome"/>
+            <wp:docPr id="1435705023" name="welcome" descr="welcome" title="welcome"/>
             <wp:cNvGraphicFramePr>
               <a:graphicFrameLocks xmlns:a="http://schemas.openxmlformats.org/drawingml/2006/main" noChangeAspect="1"/>
             </wp:cNvGraphicFramePr>
@@ -6161,7 +6161,7 @@
       <w:pPr>
         <w:pStyle w:val="2"/>
       </w:pPr>
-      <w:bookmarkStart w:id="10" w:name="_Toc242656148"/>
+      <w:bookmarkStart w:id="10" w:name="_Toc242660023"/>
       <w:r>
         <w:t>2.5 The tray icon</w:t>
       </w:r>
@@ -6247,10 +6247,10 @@
           <w:noProof/>
         </w:rPr>
         <w:drawing>
-          <wp:inline distT="0" distB="0" distL="0" distR="0" wp14:anchorId="5B645E5A" wp14:editId="34847BF0">
+          <wp:inline distT="0" distB="0" distL="0" distR="0" wp14:anchorId="49C4E334" wp14:editId="214D1DC1">
             <wp:extent cx="3962400" cy="3581400"/>
             <wp:effectExtent l="0" t="0" r="0" b="0"/>
-            <wp:docPr id="176349816" name="tray-menu" descr="tray-menu" title="tray-menu"/>
+            <wp:docPr id="265447012" name="tray-menu" descr="tray-menu" title="tray-menu"/>
             <wp:cNvGraphicFramePr>
               <a:graphicFrameLocks xmlns:a="http://schemas.openxmlformats.org/drawingml/2006/main" noChangeAspect="1"/>
             </wp:cNvGraphicFramePr>
@@ -6326,7 +6326,7 @@
           <w:left w:w="10" w:type="dxa"/>
           <w:right w:w="10" w:type="dxa"/>
         </w:tblCellMar>
-        <w:tblLook w:val="0000" w:firstRow="0" w:lastRow="0" w:firstColumn="0" w:lastColumn="0" w:noHBand="0" w:noVBand="0"/>
+        <w:tblLook w:val="04A0" w:firstRow="1" w:lastRow="0" w:firstColumn="1" w:lastColumn="0" w:noHBand="0" w:noVBand="1"/>
       </w:tblPr>
       <w:tblGrid>
         <w:gridCol w:w="9298"/>
@@ -6398,7 +6398,7 @@
       <w:pPr>
         <w:pStyle w:val="1"/>
       </w:pPr>
-      <w:bookmarkStart w:id="11" w:name="_Toc242656149"/>
+      <w:bookmarkStart w:id="11" w:name="_Toc242660024"/>
       <w:r>
         <w:t>3 Scanning the screen</w:t>
       </w:r>
@@ -6408,7 +6408,7 @@
       <w:pPr>
         <w:pStyle w:val="2"/>
       </w:pPr>
-      <w:bookmarkStart w:id="12" w:name="_Toc242656150"/>
+      <w:bookmarkStart w:id="12" w:name="_Toc242660025"/>
       <w:r>
         <w:t>3.1 Scan the whole screen</w:t>
       </w:r>
@@ -6586,10 +6586,10 @@
           <w:noProof/>
         </w:rPr>
         <w:drawing>
-          <wp:inline distT="0" distB="0" distL="0" distR="0" wp14:anchorId="5993667A" wp14:editId="06CF2A52">
+          <wp:inline distT="0" distB="0" distL="0" distR="0" wp14:anchorId="267B431E" wp14:editId="61CA8CBF">
             <wp:extent cx="5905500" cy="3409950"/>
             <wp:effectExtent l="0" t="0" r="0" b="0"/>
-            <wp:docPr id="1634797621" name="scan-screen" descr="scan-screen" title="scan-screen"/>
+            <wp:docPr id="870512053" name="scan-screen" descr="scan-screen" title="scan-screen"/>
             <wp:cNvGraphicFramePr>
               <a:graphicFrameLocks xmlns:a="http://schemas.openxmlformats.org/drawingml/2006/main" noChangeAspect="1"/>
             </wp:cNvGraphicFramePr>
@@ -6671,7 +6671,7 @@
           <w:left w:w="10" w:type="dxa"/>
           <w:right w:w="10" w:type="dxa"/>
         </w:tblCellMar>
-        <w:tblLook w:val="0000" w:firstRow="0" w:lastRow="0" w:firstColumn="0" w:lastColumn="0" w:noHBand="0" w:noVBand="0"/>
+        <w:tblLook w:val="04A0" w:firstRow="1" w:lastRow="0" w:firstColumn="1" w:lastColumn="0" w:noHBand="0" w:noVBand="1"/>
       </w:tblPr>
       <w:tblGrid>
         <w:gridCol w:w="2046"/>
@@ -7028,7 +7028,7 @@
       <w:pPr>
         <w:pStyle w:val="2"/>
       </w:pPr>
-      <w:bookmarkStart w:id="13" w:name="_Toc242656151"/>
+      <w:bookmarkStart w:id="13" w:name="_Toc242660026"/>
       <w:r>
         <w:t>3.2 Select an area</w:t>
       </w:r>
@@ -7131,10 +7131,10 @@
           <w:noProof/>
         </w:rPr>
         <w:drawing>
-          <wp:inline distT="0" distB="0" distL="0" distR="0" wp14:anchorId="549730A7" wp14:editId="47325E98">
+          <wp:inline distT="0" distB="0" distL="0" distR="0" wp14:anchorId="328653BA" wp14:editId="6646E654">
             <wp:extent cx="5905500" cy="3409950"/>
             <wp:effectExtent l="0" t="0" r="0" b="0"/>
-            <wp:docPr id="1931777780" name="scan-region" descr="scan-region" title="scan-region"/>
+            <wp:docPr id="387105150" name="scan-region" descr="scan-region" title="scan-region"/>
             <wp:cNvGraphicFramePr>
               <a:graphicFrameLocks xmlns:a="http://schemas.openxmlformats.org/drawingml/2006/main" noChangeAspect="1"/>
             </wp:cNvGraphicFramePr>
@@ -7210,7 +7210,7 @@
           <w:left w:w="10" w:type="dxa"/>
           <w:right w:w="10" w:type="dxa"/>
         </w:tblCellMar>
-        <w:tblLook w:val="0000" w:firstRow="0" w:lastRow="0" w:firstColumn="0" w:lastColumn="0" w:noHBand="0" w:noVBand="0"/>
+        <w:tblLook w:val="04A0" w:firstRow="1" w:lastRow="0" w:firstColumn="1" w:lastColumn="0" w:noHBand="0" w:noVBand="1"/>
       </w:tblPr>
       <w:tblGrid>
         <w:gridCol w:w="9298"/>
@@ -7265,7 +7265,7 @@
       <w:pPr>
         <w:pStyle w:val="2"/>
       </w:pPr>
-      <w:bookmarkStart w:id="14" w:name="_Toc242656152"/>
+      <w:bookmarkStart w:id="14" w:name="_Toc242660027"/>
       <w:r>
         <w:t>3.3 The toolbar on the scan screen</w:t>
       </w:r>
@@ -7370,7 +7370,7 @@
       <w:pPr>
         <w:pStyle w:val="2"/>
       </w:pPr>
-      <w:bookmarkStart w:id="15" w:name="_Toc242656153"/>
+      <w:bookmarkStart w:id="15" w:name="_Toc242660028"/>
       <w:r>
         <w:t>3.4 Keyboard</w:t>
       </w:r>
@@ -7397,7 +7397,7 @@
           <w:left w:w="10" w:type="dxa"/>
           <w:right w:w="10" w:type="dxa"/>
         </w:tblCellMar>
-        <w:tblLook w:val="0000" w:firstRow="0" w:lastRow="0" w:firstColumn="0" w:lastColumn="0" w:noHBand="0" w:noVBand="0"/>
+        <w:tblLook w:val="04A0" w:firstRow="1" w:lastRow="0" w:firstColumn="1" w:lastColumn="0" w:noHBand="0" w:noVBand="1"/>
       </w:tblPr>
       <w:tblGrid>
         <w:gridCol w:w="2789"/>
@@ -8044,7 +8044,7 @@
       <w:pPr>
         <w:pStyle w:val="2"/>
       </w:pPr>
-      <w:bookmarkStart w:id="16" w:name="_Toc242656154"/>
+      <w:bookmarkStart w:id="16" w:name="_Toc242660029"/>
       <w:r>
         <w:t>3.5 When no code is found</w:t>
       </w:r>
@@ -8157,7 +8157,7 @@
       <w:pPr>
         <w:pStyle w:val="1"/>
       </w:pPr>
-      <w:bookmarkStart w:id="17" w:name="_Toc242656155"/>
+      <w:bookmarkStart w:id="17" w:name="_Toc242660030"/>
       <w:r>
         <w:t>4 Other ways to scan</w:t>
       </w:r>
@@ -8167,7 +8167,7 @@
       <w:pPr>
         <w:pStyle w:val="2"/>
       </w:pPr>
-      <w:bookmarkStart w:id="18" w:name="_Toc242656156"/>
+      <w:bookmarkStart w:id="18" w:name="_Toc242660031"/>
       <w:r>
         <w:t>4.1 Webcam</w:t>
       </w:r>
@@ -8337,10 +8337,10 @@
           <w:noProof/>
         </w:rPr>
         <w:drawing>
-          <wp:inline distT="0" distB="0" distL="0" distR="0" wp14:anchorId="7263C495" wp14:editId="78798063">
+          <wp:inline distT="0" distB="0" distL="0" distR="0" wp14:anchorId="48FF0399" wp14:editId="7A39F1AD">
             <wp:extent cx="4676775" cy="3895725"/>
             <wp:effectExtent l="0" t="0" r="0" b="0"/>
-            <wp:docPr id="105468239" name="camera" descr="camera" title="camera"/>
+            <wp:docPr id="1115206651" name="camera" descr="camera" title="camera"/>
             <wp:cNvGraphicFramePr>
               <a:graphicFrameLocks xmlns:a="http://schemas.openxmlformats.org/drawingml/2006/main" noChangeAspect="1"/>
             </wp:cNvGraphicFramePr>
@@ -8512,7 +8512,7 @@
           <w:left w:w="10" w:type="dxa"/>
           <w:right w:w="10" w:type="dxa"/>
         </w:tblCellMar>
-        <w:tblLook w:val="0000" w:firstRow="0" w:lastRow="0" w:firstColumn="0" w:lastColumn="0" w:noHBand="0" w:noVBand="0"/>
+        <w:tblLook w:val="04A0" w:firstRow="1" w:lastRow="0" w:firstColumn="1" w:lastColumn="0" w:noHBand="0" w:noVBand="1"/>
       </w:tblPr>
       <w:tblGrid>
         <w:gridCol w:w="9298"/>
@@ -8566,7 +8566,7 @@
       <w:pPr>
         <w:pStyle w:val="2"/>
       </w:pPr>
-      <w:bookmarkStart w:id="19" w:name="_Toc242656157"/>
+      <w:bookmarkStart w:id="19" w:name="_Toc242660032"/>
       <w:r>
         <w:t>4.2 Image on the clipboard</w:t>
       </w:r>
@@ -8662,7 +8662,7 @@
       <w:pPr>
         <w:pStyle w:val="2"/>
       </w:pPr>
-      <w:bookmarkStart w:id="20" w:name="_Toc242656158"/>
+      <w:bookmarkStart w:id="20" w:name="_Toc242660033"/>
       <w:r>
         <w:t>4.3 Image files</w:t>
       </w:r>
@@ -8734,10 +8734,10 @@
         </w:rPr>
         <w:lastRenderedPageBreak/>
         <w:drawing>
-          <wp:inline distT="0" distB="0" distL="0" distR="0" wp14:anchorId="683F4455" wp14:editId="5E2D6025">
+          <wp:inline distT="0" distB="0" distL="0" distR="0" wp14:anchorId="1BF965AC" wp14:editId="49BE39A5">
             <wp:extent cx="4676775" cy="3667125"/>
             <wp:effectExtent l="0" t="0" r="0" b="0"/>
-            <wp:docPr id="1822763572" name="image-preview" descr="image-preview" title="image-preview"/>
+            <wp:docPr id="870861272" name="image-preview" descr="image-preview" title="image-preview"/>
             <wp:cNvGraphicFramePr>
               <a:graphicFrameLocks xmlns:a="http://schemas.openxmlformats.org/drawingml/2006/main" noChangeAspect="1"/>
             </wp:cNvGraphicFramePr>
@@ -8802,7 +8802,7 @@
       <w:pPr>
         <w:pStyle w:val="2"/>
       </w:pPr>
-      <w:bookmarkStart w:id="21" w:name="_Toc242656159"/>
+      <w:bookmarkStart w:id="21" w:name="_Toc242660034"/>
       <w:r>
         <w:t>4.4 Windows right-click menu</w:t>
       </w:r>
@@ -8839,7 +8839,7 @@
           <w:left w:w="10" w:type="dxa"/>
           <w:right w:w="10" w:type="dxa"/>
         </w:tblCellMar>
-        <w:tblLook w:val="0000" w:firstRow="0" w:lastRow="0" w:firstColumn="0" w:lastColumn="0" w:noHBand="0" w:noVBand="0"/>
+        <w:tblLook w:val="04A0" w:firstRow="1" w:lastRow="0" w:firstColumn="1" w:lastColumn="0" w:noHBand="0" w:noVBand="1"/>
       </w:tblPr>
       <w:tblGrid>
         <w:gridCol w:w="3905"/>
@@ -9233,7 +9233,7 @@
       <w:pPr>
         <w:pStyle w:val="2"/>
       </w:pPr>
-      <w:bookmarkStart w:id="22" w:name="_Toc242656160"/>
+      <w:bookmarkStart w:id="22" w:name="_Toc242660035"/>
       <w:r>
         <w:t>4.5 Command line</w:t>
       </w:r>
@@ -9264,7 +9264,7 @@
           <w:left w:w="10" w:type="dxa"/>
           <w:right w:w="10" w:type="dxa"/>
         </w:tblCellMar>
-        <w:tblLook w:val="0000" w:firstRow="0" w:lastRow="0" w:firstColumn="0" w:lastColumn="0" w:noHBand="0" w:noVBand="0"/>
+        <w:tblLook w:val="04A0" w:firstRow="1" w:lastRow="0" w:firstColumn="1" w:lastColumn="0" w:noHBand="0" w:noVBand="1"/>
       </w:tblPr>
       <w:tblGrid>
         <w:gridCol w:w="3905"/>
@@ -10110,7 +10110,7 @@
       <w:pPr>
         <w:pStyle w:val="1"/>
       </w:pPr>
-      <w:bookmarkStart w:id="23" w:name="_Toc242656161"/>
+      <w:bookmarkStart w:id="23" w:name="_Toc242660036"/>
       <w:r>
         <w:t>5 Results and details</w:t>
       </w:r>
@@ -10120,7 +10120,7 @@
       <w:pPr>
         <w:pStyle w:val="2"/>
       </w:pPr>
-      <w:bookmarkStart w:id="24" w:name="_Toc242656162"/>
+      <w:bookmarkStart w:id="24" w:name="_Toc242660037"/>
       <w:r>
         <w:t>5.1 Result labels</w:t>
       </w:r>
@@ -10215,7 +10215,7 @@
       <w:pPr>
         <w:pStyle w:val="2"/>
       </w:pPr>
-      <w:bookmarkStart w:id="25" w:name="_Toc242656163"/>
+      <w:bookmarkStart w:id="25" w:name="_Toc242660038"/>
       <w:r>
         <w:t>5.2 What Enter or a click does</w:t>
       </w:r>
@@ -10237,7 +10237,7 @@
           <w:left w:w="10" w:type="dxa"/>
           <w:right w:w="10" w:type="dxa"/>
         </w:tblCellMar>
-        <w:tblLook w:val="0000" w:firstRow="0" w:lastRow="0" w:firstColumn="0" w:lastColumn="0" w:noHBand="0" w:noVBand="0"/>
+        <w:tblLook w:val="04A0" w:firstRow="1" w:lastRow="0" w:firstColumn="1" w:lastColumn="0" w:noHBand="0" w:noVBand="1"/>
       </w:tblPr>
       <w:tblGrid>
         <w:gridCol w:w="3347"/>
@@ -10498,7 +10498,7 @@
       <w:pPr>
         <w:pStyle w:val="2"/>
       </w:pPr>
-      <w:bookmarkStart w:id="26" w:name="_Toc242656164"/>
+      <w:bookmarkStart w:id="26" w:name="_Toc242660039"/>
       <w:r>
         <w:t>5.3 The detail card</w:t>
       </w:r>
@@ -10531,10 +10531,10 @@
         </w:rPr>
         <w:lastRenderedPageBreak/>
         <w:drawing>
-          <wp:inline distT="0" distB="0" distL="0" distR="0" wp14:anchorId="0DCE6188" wp14:editId="41805C13">
+          <wp:inline distT="0" distB="0" distL="0" distR="0" wp14:anchorId="21B657B1" wp14:editId="6B4EF897">
             <wp:extent cx="4324350" cy="2600325"/>
             <wp:effectExtent l="0" t="0" r="0" b="0"/>
-            <wp:docPr id="1256428556" name="detail-wifi" descr="detail-wifi" title="detail-wifi"/>
+            <wp:docPr id="2018420192" name="detail-wifi" descr="detail-wifi" title="detail-wifi"/>
             <wp:cNvGraphicFramePr>
               <a:graphicFrameLocks xmlns:a="http://schemas.openxmlformats.org/drawingml/2006/main" noChangeAspect="1"/>
             </wp:cNvGraphicFramePr>
@@ -10599,7 +10599,7 @@
       <w:pPr>
         <w:pStyle w:val="2"/>
       </w:pPr>
-      <w:bookmarkStart w:id="27" w:name="_Toc242656165"/>
+      <w:bookmarkStart w:id="27" w:name="_Toc242660040"/>
       <w:r>
         <w:t>5.4 Buttons for each kind of content</w:t>
       </w:r>
@@ -10621,7 +10621,7 @@
           <w:left w:w="10" w:type="dxa"/>
           <w:right w:w="10" w:type="dxa"/>
         </w:tblCellMar>
-        <w:tblLook w:val="0000" w:firstRow="0" w:lastRow="0" w:firstColumn="0" w:lastColumn="0" w:noHBand="0" w:noVBand="0"/>
+        <w:tblLook w:val="04A0" w:firstRow="1" w:lastRow="0" w:firstColumn="1" w:lastColumn="0" w:noHBand="0" w:noVBand="1"/>
       </w:tblPr>
       <w:tblGrid>
         <w:gridCol w:w="2789"/>
@@ -11731,7 +11731,7 @@
       <w:pPr>
         <w:pStyle w:val="2"/>
       </w:pPr>
-      <w:bookmarkStart w:id="28" w:name="_Toc242656166"/>
+      <w:bookmarkStart w:id="28" w:name="_Toc242660041"/>
       <w:r>
         <w:lastRenderedPageBreak/>
         <w:t>5.5 Taiwan e-invoices</w:t>
@@ -11767,7 +11767,7 @@
       <w:pPr>
         <w:pStyle w:val="2"/>
       </w:pPr>
-      <w:bookmarkStart w:id="29" w:name="_Toc242656167"/>
+      <w:bookmarkStart w:id="29" w:name="_Toc242660042"/>
       <w:r>
         <w:t>5.6 Sensitive data</w:t>
       </w:r>
@@ -11810,7 +11810,7 @@
       <w:pPr>
         <w:pStyle w:val="1"/>
       </w:pPr>
-      <w:bookmarkStart w:id="30" w:name="_Toc242656168"/>
+      <w:bookmarkStart w:id="30" w:name="_Toc242660043"/>
       <w:r>
         <w:t>6 Link safety</w:t>
       </w:r>
@@ -11825,7 +11825,7 @@
       <w:pPr>
         <w:pStyle w:val="2"/>
       </w:pPr>
-      <w:bookmarkStart w:id="31" w:name="_Toc242656169"/>
+      <w:bookmarkStart w:id="31" w:name="_Toc242660044"/>
       <w:r>
         <w:t>6.1 Check the site name before opening</w:t>
       </w:r>
@@ -11847,10 +11847,10 @@
           <w:noProof/>
         </w:rPr>
         <w:drawing>
-          <wp:inline distT="0" distB="0" distL="0" distR="0" wp14:anchorId="74590B2F" wp14:editId="170EF274">
+          <wp:inline distT="0" distB="0" distL="0" distR="0" wp14:anchorId="4FA3AA25" wp14:editId="54C33FDB">
             <wp:extent cx="4324350" cy="2781300"/>
             <wp:effectExtent l="0" t="0" r="0" b="0"/>
-            <wp:docPr id="502722263" name="detail-warning" descr="detail-warning" title="detail-warning"/>
+            <wp:docPr id="808815672" name="detail-warning" descr="detail-warning" title="detail-warning"/>
             <wp:cNvGraphicFramePr>
               <a:graphicFrameLocks xmlns:a="http://schemas.openxmlformats.org/drawingml/2006/main" noChangeAspect="1"/>
             </wp:cNvGraphicFramePr>
@@ -11915,7 +11915,7 @@
       <w:pPr>
         <w:pStyle w:val="2"/>
       </w:pPr>
-      <w:bookmarkStart w:id="32" w:name="_Toc242656170"/>
+      <w:bookmarkStart w:id="32" w:name="_Toc242660045"/>
       <w:r>
         <w:t>6.2 Warning levels</w:t>
       </w:r>
@@ -11937,7 +11937,7 @@
           <w:left w:w="10" w:type="dxa"/>
           <w:right w:w="10" w:type="dxa"/>
         </w:tblCellMar>
-        <w:tblLook w:val="0000" w:firstRow="0" w:lastRow="0" w:firstColumn="0" w:lastColumn="0" w:noHBand="0" w:noVBand="0"/>
+        <w:tblLook w:val="04A0" w:firstRow="1" w:lastRow="0" w:firstColumn="1" w:lastColumn="0" w:noHBand="0" w:noVBand="1"/>
       </w:tblPr>
       <w:tblGrid>
         <w:gridCol w:w="1674"/>
@@ -12308,7 +12308,7 @@
       <w:pPr>
         <w:pStyle w:val="2"/>
       </w:pPr>
-      <w:bookmarkStart w:id="33" w:name="_Toc242656171"/>
+      <w:bookmarkStart w:id="33" w:name="_Toc242660046"/>
       <w:r>
         <w:t>6.3 What is checked</w:t>
       </w:r>
@@ -12330,7 +12330,7 @@
           <w:left w:w="10" w:type="dxa"/>
           <w:right w:w="10" w:type="dxa"/>
         </w:tblCellMar>
-        <w:tblLook w:val="0000" w:firstRow="0" w:lastRow="0" w:firstColumn="0" w:lastColumn="0" w:noHBand="0" w:noVBand="0"/>
+        <w:tblLook w:val="04A0" w:firstRow="1" w:lastRow="0" w:firstColumn="1" w:lastColumn="0" w:noHBand="0" w:noVBand="1"/>
       </w:tblPr>
       <w:tblGrid>
         <w:gridCol w:w="2789"/>
@@ -13324,7 +13324,7 @@
       <w:pPr>
         <w:pStyle w:val="2"/>
       </w:pPr>
-      <w:bookmarkStart w:id="34" w:name="_Toc242656172"/>
+      <w:bookmarkStart w:id="34" w:name="_Toc242660047"/>
       <w:r>
         <w:t>6.4 Deceptive links</w:t>
       </w:r>
@@ -13357,10 +13357,10 @@
         </w:rPr>
         <w:lastRenderedPageBreak/>
         <w:drawing>
-          <wp:inline distT="0" distB="0" distL="0" distR="0" wp14:anchorId="337800AB" wp14:editId="1DBE6043">
+          <wp:inline distT="0" distB="0" distL="0" distR="0" wp14:anchorId="61759C68" wp14:editId="77FE388A">
             <wp:extent cx="4324350" cy="2600325"/>
             <wp:effectExtent l="0" t="0" r="0" b="0"/>
-            <wp:docPr id="548134321" name="detail-danger" descr="detail-danger" title="detail-danger"/>
+            <wp:docPr id="2126048653" name="detail-danger" descr="detail-danger" title="detail-danger"/>
             <wp:cNvGraphicFramePr>
               <a:graphicFrameLocks xmlns:a="http://schemas.openxmlformats.org/drawingml/2006/main" noChangeAspect="1"/>
             </wp:cNvGraphicFramePr>
@@ -13450,7 +13450,7 @@
       <w:pPr>
         <w:pStyle w:val="2"/>
       </w:pPr>
-      <w:bookmarkStart w:id="35" w:name="_Toc242656173"/>
+      <w:bookmarkStart w:id="35" w:name="_Toc242660048"/>
       <w:r>
         <w:t>6.5 Trusted sites and automatic opening</w:t>
       </w:r>
@@ -13584,10 +13584,10 @@
         </w:rPr>
         <w:lastRenderedPageBreak/>
         <w:drawing>
-          <wp:inline distT="0" distB="0" distL="0" distR="0" wp14:anchorId="2B7FB066" wp14:editId="5C9F0C86">
+          <wp:inline distT="0" distB="0" distL="0" distR="0" wp14:anchorId="6ECC0283" wp14:editId="23894983">
             <wp:extent cx="4324350" cy="2600325"/>
             <wp:effectExtent l="0" t="0" r="0" b="0"/>
-            <wp:docPr id="1094318680" name="detail-link" descr="detail-link" title="detail-link"/>
+            <wp:docPr id="984374854" name="detail-link" descr="detail-link" title="detail-link"/>
             <wp:cNvGraphicFramePr>
               <a:graphicFrameLocks xmlns:a="http://schemas.openxmlformats.org/drawingml/2006/main" noChangeAspect="1"/>
             </wp:cNvGraphicFramePr>
@@ -13670,7 +13670,7 @@
       <w:pPr>
         <w:pStyle w:val="1"/>
       </w:pPr>
-      <w:bookmarkStart w:id="36" w:name="_Toc242656174"/>
+      <w:bookmarkStart w:id="36" w:name="_Toc242660049"/>
       <w:r>
         <w:t>7 Floating toolbar and bubble</w:t>
       </w:r>
@@ -13735,7 +13735,7 @@
       <w:pPr>
         <w:pStyle w:val="2"/>
       </w:pPr>
-      <w:bookmarkStart w:id="37" w:name="_Toc242656175"/>
+      <w:bookmarkStart w:id="37" w:name="_Toc242660050"/>
       <w:r>
         <w:t>7.1 Toolbar buttons</w:t>
       </w:r>
@@ -13752,10 +13752,10 @@
           <w:noProof/>
         </w:rPr>
         <w:drawing>
-          <wp:inline distT="0" distB="0" distL="0" distR="0" wp14:anchorId="5CB057DB" wp14:editId="74274AF7">
+          <wp:inline distT="0" distB="0" distL="0" distR="0" wp14:anchorId="64D5EC0C" wp14:editId="7DCD70CE">
             <wp:extent cx="3962400" cy="1428750"/>
             <wp:effectExtent l="0" t="0" r="0" b="0"/>
-            <wp:docPr id="1614536154" name="toolbar-row" descr="toolbar-row" title="toolbar-row"/>
+            <wp:docPr id="2106183534" name="toolbar-row" descr="toolbar-row" title="toolbar-row"/>
             <wp:cNvGraphicFramePr>
               <a:graphicFrameLocks xmlns:a="http://schemas.openxmlformats.org/drawingml/2006/main" noChangeAspect="1"/>
             </wp:cNvGraphicFramePr>
@@ -13832,7 +13832,7 @@
           <w:left w:w="10" w:type="dxa"/>
           <w:right w:w="10" w:type="dxa"/>
         </w:tblCellMar>
-        <w:tblLook w:val="0000" w:firstRow="0" w:lastRow="0" w:firstColumn="0" w:lastColumn="0" w:noHBand="0" w:noVBand="0"/>
+        <w:tblLook w:val="04A0" w:firstRow="1" w:lastRow="0" w:firstColumn="1" w:lastColumn="0" w:noHBand="0" w:noVBand="1"/>
       </w:tblPr>
       <w:tblGrid>
         <w:gridCol w:w="3161"/>
@@ -14576,7 +14576,7 @@
                 <w:sz w:val="19"/>
                 <w:szCs w:val="19"/>
               </w:rPr>
-              <w:t>Collapse to bubble</w:t>
+              <w:t>User manual (“?” button)</w:t>
             </w:r>
           </w:p>
         </w:tc>
@@ -14600,7 +14600,7 @@
                 <w:sz w:val="19"/>
                 <w:szCs w:val="19"/>
               </w:rPr>
-              <w:t>Hides the toolbar and shows the small round bubble instead.</w:t>
+              <w:t>Opens the PDF user manual on GitHub in a new browser tab: the Traditional Chinese edition when the UI is in Chinese, the English edition otherwise.</w:t>
             </w:r>
           </w:p>
         </w:tc>
@@ -14635,6 +14635,66 @@
                 <w:sz w:val="19"/>
                 <w:szCs w:val="19"/>
               </w:rPr>
+              <w:t>Collapse to bubble</w:t>
+            </w:r>
+          </w:p>
+        </w:tc>
+        <w:tc>
+          <w:tcPr>
+            <w:tcW w:w="6137" w:type="dxa"/>
+            <w:tcMar>
+              <w:top w:w="90" w:type="dxa"/>
+              <w:left w:w="140" w:type="dxa"/>
+              <w:bottom w:w="90" w:type="dxa"/>
+              <w:right w:w="140" w:type="dxa"/>
+            </w:tcMar>
+            <w:vAlign w:val="center"/>
+          </w:tcPr>
+          <w:p>
+            <w:pPr>
+              <w:spacing w:after="0" w:line="300" w:lineRule="auto"/>
+            </w:pPr>
+            <w:r>
+              <w:rPr>
+                <w:sz w:val="19"/>
+                <w:szCs w:val="19"/>
+              </w:rPr>
+              <w:t>Hides the toolbar and shows the small round bubble instead.</w:t>
+            </w:r>
+          </w:p>
+        </w:tc>
+      </w:tr>
+      <w:tr>
+        <w:tblPrEx>
+          <w:tblCellMar>
+            <w:top w:w="0" w:type="dxa"/>
+            <w:bottom w:w="0" w:type="dxa"/>
+          </w:tblCellMar>
+        </w:tblPrEx>
+        <w:trPr>
+          <w:cantSplit/>
+        </w:trPr>
+        <w:tc>
+          <w:tcPr>
+            <w:tcW w:w="3161" w:type="dxa"/>
+            <w:tcMar>
+              <w:top w:w="90" w:type="dxa"/>
+              <w:left w:w="140" w:type="dxa"/>
+              <w:bottom w:w="90" w:type="dxa"/>
+              <w:right w:w="140" w:type="dxa"/>
+            </w:tcMar>
+            <w:vAlign w:val="center"/>
+          </w:tcPr>
+          <w:p>
+            <w:pPr>
+              <w:spacing w:after="0" w:line="300" w:lineRule="auto"/>
+            </w:pPr>
+            <w:r>
+              <w:rPr>
+                <w:sz w:val="19"/>
+                <w:szCs w:val="19"/>
+              </w:rPr>
+              <w:lastRenderedPageBreak/>
               <w:t>Close toolbar</w:t>
             </w:r>
           </w:p>
@@ -14674,9 +14734,8 @@
       <w:pPr>
         <w:pStyle w:val="2"/>
       </w:pPr>
-      <w:bookmarkStart w:id="38" w:name="_Toc242656176"/>
-      <w:r>
-        <w:lastRenderedPageBreak/>
+      <w:bookmarkStart w:id="38" w:name="_Toc242660051"/>
+      <w:r>
         <w:t>7.2 Vertical toolbar (right or left)</w:t>
       </w:r>
       <w:bookmarkEnd w:id="38"/>
@@ -14701,7 +14760,7 @@
           <w:left w:w="10" w:type="dxa"/>
           <w:right w:w="10" w:type="dxa"/>
         </w:tblCellMar>
-        <w:tblLook w:val="0000" w:firstRow="0" w:lastRow="0" w:firstColumn="0" w:lastColumn="0" w:noHBand="0" w:noVBand="0"/>
+        <w:tblLook w:val="04A0" w:firstRow="1" w:lastRow="0" w:firstColumn="1" w:lastColumn="0" w:noHBand="0" w:noVBand="1"/>
       </w:tblPr>
       <w:tblGrid>
         <w:gridCol w:w="4649"/>
@@ -14737,10 +14796,10 @@
                 <w:noProof/>
               </w:rPr>
               <w:drawing>
-                <wp:inline distT="0" distB="0" distL="0" distR="0" wp14:anchorId="2273E0D7" wp14:editId="52855C5D">
+                <wp:inline distT="0" distB="0" distL="0" distR="0" wp14:anchorId="4D6D96FB" wp14:editId="0045F6AD">
                   <wp:extent cx="2809875" cy="3905250"/>
                   <wp:effectExtent l="0" t="0" r="0" b="0"/>
-                  <wp:docPr id="589167354" name="toolbar-right" descr="toolbar-right" title="toolbar-right"/>
+                  <wp:docPr id="231886410" name="toolbar-right" descr="toolbar-right" title="toolbar-right"/>
                   <wp:cNvGraphicFramePr>
                     <a:graphicFrameLocks xmlns:a="http://schemas.openxmlformats.org/drawingml/2006/main" noChangeAspect="1"/>
                   </wp:cNvGraphicFramePr>
@@ -14811,10 +14870,10 @@
                 <w:noProof/>
               </w:rPr>
               <w:drawing>
-                <wp:inline distT="0" distB="0" distL="0" distR="0" wp14:anchorId="613547D4" wp14:editId="54118D5F">
+                <wp:inline distT="0" distB="0" distL="0" distR="0" wp14:anchorId="1714F602" wp14:editId="1A2E762F">
                   <wp:extent cx="2809875" cy="3905250"/>
                   <wp:effectExtent l="0" t="0" r="0" b="0"/>
-                  <wp:docPr id="261921713" name="toolbar-left" descr="toolbar-left" title="toolbar-left"/>
+                  <wp:docPr id="1867067313" name="toolbar-left" descr="toolbar-left" title="toolbar-left"/>
                   <wp:cNvGraphicFramePr>
                     <a:graphicFrameLocks xmlns:a="http://schemas.openxmlformats.org/drawingml/2006/main" noChangeAspect="1"/>
                   </wp:cNvGraphicFramePr>
@@ -15013,14 +15072,18 @@
     </w:p>
     <w:p>
       <w:r>
-        <w:t>The change takes effect immediately. The toolbar moves to the default place of the new layout: centred at the top for the horizontal layout, vertically centred at the chosen edge for the vertical one. You can still drag it anywhere afterwards.</w:t>
+        <w:t xml:space="preserve">The change takes effect immediately. The toolbar moves to the default place of the new layout: </w:t>
+      </w:r>
+      <w:r>
+        <w:lastRenderedPageBreak/>
+        <w:t>centred at the top for the horizontal layout, vertically centred at the chosen edge for the vertical one. You can still drag it anywhere afterwards.</w:t>
       </w:r>
     </w:p>
     <w:p>
       <w:pPr>
         <w:pStyle w:val="2"/>
       </w:pPr>
-      <w:bookmarkStart w:id="39" w:name="_Toc242656177"/>
+      <w:bookmarkStart w:id="39" w:name="_Toc242660052"/>
       <w:r>
         <w:t>7.3 Moving the toolbar</w:t>
       </w:r>
@@ -15028,18 +15091,14 @@
     </w:p>
     <w:p>
       <w:r>
-        <w:t xml:space="preserve">Hold the dotted handle at one end of the toolbar and drag. The program remembers the last </w:t>
-      </w:r>
-      <w:r>
-        <w:lastRenderedPageBreak/>
-        <w:t>position and shows the toolbar there next time. If that position is no longer on any monitor, for example after unplugging an external display, the toolbar returns to its default place.</w:t>
+        <w:t>Hold the dotted handle at one end of the toolbar and drag. The program remembers the last position and shows the toolbar there next time. If that position is no longer on any monitor, for example after unplugging an external display, the toolbar returns to its default place.</w:t>
       </w:r>
     </w:p>
     <w:p>
       <w:pPr>
         <w:pStyle w:val="2"/>
       </w:pPr>
-      <w:bookmarkStart w:id="40" w:name="_Toc242656178"/>
+      <w:bookmarkStart w:id="40" w:name="_Toc242660053"/>
       <w:r>
         <w:t>7.4 The floating bubble</w:t>
       </w:r>
@@ -15061,10 +15120,10 @@
           <w:noProof/>
         </w:rPr>
         <w:drawing>
-          <wp:inline distT="0" distB="0" distL="0" distR="0" wp14:anchorId="40694AEE" wp14:editId="226C6900">
+          <wp:inline distT="0" distB="0" distL="0" distR="0" wp14:anchorId="0378A78D" wp14:editId="46C073EA">
             <wp:extent cx="2876550" cy="1752600"/>
             <wp:effectExtent l="0" t="0" r="0" b="0"/>
-            <wp:docPr id="1412985006" name="bubble" descr="bubble" title="bubble"/>
+            <wp:docPr id="1651507005" name="bubble" descr="bubble" title="bubble"/>
             <wp:cNvGraphicFramePr>
               <a:graphicFrameLocks xmlns:a="http://schemas.openxmlformats.org/drawingml/2006/main" noChangeAspect="1"/>
             </wp:cNvGraphicFramePr>
@@ -15141,7 +15200,7 @@
           <w:left w:w="10" w:type="dxa"/>
           <w:right w:w="10" w:type="dxa"/>
         </w:tblCellMar>
-        <w:tblLook w:val="0000" w:firstRow="0" w:lastRow="0" w:firstColumn="0" w:lastColumn="0" w:noHBand="0" w:noVBand="0"/>
+        <w:tblLook w:val="04A0" w:firstRow="1" w:lastRow="0" w:firstColumn="1" w:lastColumn="0" w:noHBand="0" w:noVBand="1"/>
       </w:tblPr>
       <w:tblGrid>
         <w:gridCol w:w="2789"/>
@@ -15572,7 +15631,7 @@
       <w:pPr>
         <w:pStyle w:val="2"/>
       </w:pPr>
-      <w:bookmarkStart w:id="41" w:name="_Toc242656179"/>
+      <w:bookmarkStart w:id="41" w:name="_Toc242660054"/>
       <w:r>
         <w:t>7.5 Hiding during full-screen apps</w:t>
       </w:r>
@@ -15587,7 +15646,15 @@
           <w:b/>
           <w:bCs/>
         </w:rPr>
-        <w:t>Settings › General › Hide during full-screen apps</w:t>
+        <w:t xml:space="preserve">Settings › General </w:t>
+      </w:r>
+      <w:r>
+        <w:rPr>
+          <w:b/>
+          <w:bCs/>
+        </w:rPr>
+        <w:lastRenderedPageBreak/>
+        <w:t>› Hide during full-screen apps</w:t>
       </w:r>
       <w:r>
         <w:t>.</w:t>
@@ -15615,7 +15682,7 @@
       <w:pPr>
         <w:pStyle w:val="1"/>
       </w:pPr>
-      <w:bookmarkStart w:id="42" w:name="_Toc242656180"/>
+      <w:bookmarkStart w:id="42" w:name="_Toc242660055"/>
       <w:r>
         <w:t>8 Creating QR codes</w:t>
       </w:r>
@@ -15754,10 +15821,10 @@
           <w:noProof/>
         </w:rPr>
         <w:drawing>
-          <wp:inline distT="0" distB="0" distL="0" distR="0" wp14:anchorId="3404E4FD" wp14:editId="3AD19C65">
+          <wp:inline distT="0" distB="0" distL="0" distR="0" wp14:anchorId="602BC409" wp14:editId="0A0C6C22">
             <wp:extent cx="4676775" cy="3314700"/>
             <wp:effectExtent l="0" t="0" r="0" b="0"/>
-            <wp:docPr id="882656215" name="generator" descr="generator" title="generator"/>
+            <wp:docPr id="1943673898" name="generator" descr="generator" title="generator"/>
             <wp:cNvGraphicFramePr>
               <a:graphicFrameLocks xmlns:a="http://schemas.openxmlformats.org/drawingml/2006/main" noChangeAspect="1"/>
             </wp:cNvGraphicFramePr>
@@ -15822,7 +15889,7 @@
       <w:pPr>
         <w:pStyle w:val="2"/>
       </w:pPr>
-      <w:bookmarkStart w:id="43" w:name="_Toc242656181"/>
+      <w:bookmarkStart w:id="43" w:name="_Toc242660056"/>
       <w:r>
         <w:t>8.1 Error correction</w:t>
       </w:r>
@@ -15849,7 +15916,7 @@
           <w:left w:w="10" w:type="dxa"/>
           <w:right w:w="10" w:type="dxa"/>
         </w:tblCellMar>
-        <w:tblLook w:val="0000" w:firstRow="0" w:lastRow="0" w:firstColumn="0" w:lastColumn="0" w:noHBand="0" w:noVBand="0"/>
+        <w:tblLook w:val="04A0" w:firstRow="1" w:lastRow="0" w:firstColumn="1" w:lastColumn="0" w:noHBand="0" w:noVBand="1"/>
       </w:tblPr>
       <w:tblGrid>
         <w:gridCol w:w="3347"/>
@@ -16181,7 +16248,7 @@
           <w:left w:w="10" w:type="dxa"/>
           <w:right w:w="10" w:type="dxa"/>
         </w:tblCellMar>
-        <w:tblLook w:val="0000" w:firstRow="0" w:lastRow="0" w:firstColumn="0" w:lastColumn="0" w:noHBand="0" w:noVBand="0"/>
+        <w:tblLook w:val="04A0" w:firstRow="1" w:lastRow="0" w:firstColumn="1" w:lastColumn="0" w:noHBand="0" w:noVBand="1"/>
       </w:tblPr>
       <w:tblGrid>
         <w:gridCol w:w="9298"/>
@@ -16302,7 +16369,7 @@
       <w:pPr>
         <w:pStyle w:val="1"/>
       </w:pPr>
-      <w:bookmarkStart w:id="44" w:name="_Toc242656182"/>
+      <w:bookmarkStart w:id="44" w:name="_Toc242660057"/>
       <w:r>
         <w:t>9 Settings</w:t>
       </w:r>
@@ -16327,7 +16394,7 @@
       <w:pPr>
         <w:pStyle w:val="2"/>
       </w:pPr>
-      <w:bookmarkStart w:id="45" w:name="_Toc242656183"/>
+      <w:bookmarkStart w:id="45" w:name="_Toc242660058"/>
       <w:r>
         <w:t>9.1 General</w:t>
       </w:r>
@@ -16344,10 +16411,10 @@
           <w:noProof/>
         </w:rPr>
         <w:drawing>
-          <wp:inline distT="0" distB="0" distL="0" distR="0" wp14:anchorId="1669AA68" wp14:editId="6EBB17D8">
+          <wp:inline distT="0" distB="0" distL="0" distR="0" wp14:anchorId="199D062E" wp14:editId="3802E489">
             <wp:extent cx="5038725" cy="3714750"/>
             <wp:effectExtent l="0" t="0" r="0" b="0"/>
-            <wp:docPr id="1677208287" name="settings-general" descr="settings-general" title="settings-general"/>
+            <wp:docPr id="1321334695" name="settings-general" descr="settings-general" title="settings-general"/>
             <wp:cNvGraphicFramePr>
               <a:graphicFrameLocks xmlns:a="http://schemas.openxmlformats.org/drawingml/2006/main" noChangeAspect="1"/>
             </wp:cNvGraphicFramePr>
@@ -16424,7 +16491,7 @@
           <w:left w:w="10" w:type="dxa"/>
           <w:right w:w="10" w:type="dxa"/>
         </w:tblCellMar>
-        <w:tblLook w:val="0000" w:firstRow="0" w:lastRow="0" w:firstColumn="0" w:lastColumn="0" w:noHBand="0" w:noVBand="0"/>
+        <w:tblLook w:val="04A0" w:firstRow="1" w:lastRow="0" w:firstColumn="1" w:lastColumn="0" w:noHBand="0" w:noVBand="1"/>
       </w:tblPr>
       <w:tblGrid>
         <w:gridCol w:w="3161"/>
@@ -17122,7 +17189,7 @@
       <w:pPr>
         <w:pStyle w:val="2"/>
       </w:pPr>
-      <w:bookmarkStart w:id="46" w:name="_Toc242656184"/>
+      <w:bookmarkStart w:id="46" w:name="_Toc242660059"/>
       <w:r>
         <w:t>9.2 Scanning</w:t>
       </w:r>
@@ -17139,10 +17206,10 @@
           <w:noProof/>
         </w:rPr>
         <w:drawing>
-          <wp:inline distT="0" distB="0" distL="0" distR="0" wp14:anchorId="1A8E9EED" wp14:editId="6C739B79">
+          <wp:inline distT="0" distB="0" distL="0" distR="0" wp14:anchorId="62061CBB" wp14:editId="1F891E48">
             <wp:extent cx="5038725" cy="3714750"/>
             <wp:effectExtent l="0" t="0" r="0" b="0"/>
-            <wp:docPr id="811688805" name="settings-scanning" descr="settings-scanning" title="settings-scanning"/>
+            <wp:docPr id="11936304" name="settings-scanning" descr="settings-scanning" title="settings-scanning"/>
             <wp:cNvGraphicFramePr>
               <a:graphicFrameLocks xmlns:a="http://schemas.openxmlformats.org/drawingml/2006/main" noChangeAspect="1"/>
             </wp:cNvGraphicFramePr>
@@ -17219,7 +17286,7 @@
           <w:left w:w="10" w:type="dxa"/>
           <w:right w:w="10" w:type="dxa"/>
         </w:tblCellMar>
-        <w:tblLook w:val="0000" w:firstRow="0" w:lastRow="0" w:firstColumn="0" w:lastColumn="0" w:noHBand="0" w:noVBand="0"/>
+        <w:tblLook w:val="04A0" w:firstRow="1" w:lastRow="0" w:firstColumn="1" w:lastColumn="0" w:noHBand="0" w:noVBand="1"/>
       </w:tblPr>
       <w:tblGrid>
         <w:gridCol w:w="3161"/>
@@ -17615,7 +17682,7 @@
       <w:pPr>
         <w:pStyle w:val="2"/>
       </w:pPr>
-      <w:bookmarkStart w:id="47" w:name="_Toc242656185"/>
+      <w:bookmarkStart w:id="47" w:name="_Toc242660060"/>
       <w:r>
         <w:t>9.3 Camera</w:t>
       </w:r>
@@ -17632,10 +17699,10 @@
           <w:noProof/>
         </w:rPr>
         <w:drawing>
-          <wp:inline distT="0" distB="0" distL="0" distR="0" wp14:anchorId="2A2065B2" wp14:editId="37EA3781">
+          <wp:inline distT="0" distB="0" distL="0" distR="0" wp14:anchorId="6A5B7CA8" wp14:editId="52CA2454">
             <wp:extent cx="5038725" cy="3714750"/>
             <wp:effectExtent l="0" t="0" r="0" b="0"/>
-            <wp:docPr id="1937024618" name="settings-camera" descr="settings-camera" title="settings-camera"/>
+            <wp:docPr id="1304268892" name="settings-camera" descr="settings-camera" title="settings-camera"/>
             <wp:cNvGraphicFramePr>
               <a:graphicFrameLocks xmlns:a="http://schemas.openxmlformats.org/drawingml/2006/main" noChangeAspect="1"/>
             </wp:cNvGraphicFramePr>
@@ -17712,7 +17779,7 @@
           <w:left w:w="10" w:type="dxa"/>
           <w:right w:w="10" w:type="dxa"/>
         </w:tblCellMar>
-        <w:tblLook w:val="0000" w:firstRow="0" w:lastRow="0" w:firstColumn="0" w:lastColumn="0" w:noHBand="0" w:noVBand="0"/>
+        <w:tblLook w:val="04A0" w:firstRow="1" w:lastRow="0" w:firstColumn="1" w:lastColumn="0" w:noHBand="0" w:noVBand="1"/>
       </w:tblPr>
       <w:tblGrid>
         <w:gridCol w:w="3161"/>
@@ -18033,7 +18100,7 @@
       <w:pPr>
         <w:pStyle w:val="2"/>
       </w:pPr>
-      <w:bookmarkStart w:id="48" w:name="_Toc242656186"/>
+      <w:bookmarkStart w:id="48" w:name="_Toc242660061"/>
       <w:r>
         <w:t>9.4 Shortcuts</w:t>
       </w:r>
@@ -18050,10 +18117,10 @@
           <w:noProof/>
         </w:rPr>
         <w:drawing>
-          <wp:inline distT="0" distB="0" distL="0" distR="0" wp14:anchorId="2F602189" wp14:editId="15F35E29">
+          <wp:inline distT="0" distB="0" distL="0" distR="0" wp14:anchorId="2FE0888D" wp14:editId="53E3617D">
             <wp:extent cx="5038725" cy="3714750"/>
             <wp:effectExtent l="0" t="0" r="0" b="0"/>
-            <wp:docPr id="179367117" name="settings-shortcuts" descr="settings-shortcuts" title="settings-shortcuts"/>
+            <wp:docPr id="1649968057" name="settings-shortcuts" descr="settings-shortcuts" title="settings-shortcuts"/>
             <wp:cNvGraphicFramePr>
               <a:graphicFrameLocks xmlns:a="http://schemas.openxmlformats.org/drawingml/2006/main" noChangeAspect="1"/>
             </wp:cNvGraphicFramePr>
@@ -18130,7 +18197,7 @@
           <w:left w:w="10" w:type="dxa"/>
           <w:right w:w="10" w:type="dxa"/>
         </w:tblCellMar>
-        <w:tblLook w:val="0000" w:firstRow="0" w:lastRow="0" w:firstColumn="0" w:lastColumn="0" w:noHBand="0" w:noVBand="0"/>
+        <w:tblLook w:val="04A0" w:firstRow="1" w:lastRow="0" w:firstColumn="1" w:lastColumn="0" w:noHBand="0" w:noVBand="1"/>
       </w:tblPr>
       <w:tblGrid>
         <w:gridCol w:w="3161"/>
@@ -18863,7 +18930,7 @@
       <w:pPr>
         <w:pStyle w:val="2"/>
       </w:pPr>
-      <w:bookmarkStart w:id="49" w:name="_Toc242656187"/>
+      <w:bookmarkStart w:id="49" w:name="_Toc242660062"/>
       <w:r>
         <w:t>9.5 Privacy &amp; history</w:t>
       </w:r>
@@ -18880,10 +18947,10 @@
           <w:noProof/>
         </w:rPr>
         <w:drawing>
-          <wp:inline distT="0" distB="0" distL="0" distR="0" wp14:anchorId="3470191F" wp14:editId="4B808604">
+          <wp:inline distT="0" distB="0" distL="0" distR="0" wp14:anchorId="551FD133" wp14:editId="40A974BC">
             <wp:extent cx="5038725" cy="3714750"/>
             <wp:effectExtent l="0" t="0" r="0" b="0"/>
-            <wp:docPr id="152702497" name="settings-privacy" descr="settings-privacy" title="settings-privacy"/>
+            <wp:docPr id="1572664427" name="settings-privacy" descr="settings-privacy" title="settings-privacy"/>
             <wp:cNvGraphicFramePr>
               <a:graphicFrameLocks xmlns:a="http://schemas.openxmlformats.org/drawingml/2006/main" noChangeAspect="1"/>
             </wp:cNvGraphicFramePr>
@@ -18960,7 +19027,7 @@
           <w:left w:w="10" w:type="dxa"/>
           <w:right w:w="10" w:type="dxa"/>
         </w:tblCellMar>
-        <w:tblLook w:val="0000" w:firstRow="0" w:lastRow="0" w:firstColumn="0" w:lastColumn="0" w:noHBand="0" w:noVBand="0"/>
+        <w:tblLook w:val="04A0" w:firstRow="1" w:lastRow="0" w:firstColumn="1" w:lastColumn="0" w:noHBand="0" w:noVBand="1"/>
       </w:tblPr>
       <w:tblGrid>
         <w:gridCol w:w="3161"/>
@@ -19312,7 +19379,7 @@
       <w:pPr>
         <w:pStyle w:val="2"/>
       </w:pPr>
-      <w:bookmarkStart w:id="50" w:name="_Toc242656188"/>
+      <w:bookmarkStart w:id="50" w:name="_Toc242660063"/>
       <w:r>
         <w:lastRenderedPageBreak/>
         <w:t>9.6 About</w:t>
@@ -19330,10 +19397,10 @@
           <w:noProof/>
         </w:rPr>
         <w:drawing>
-          <wp:inline distT="0" distB="0" distL="0" distR="0" wp14:anchorId="1CA2136F" wp14:editId="10D043D9">
+          <wp:inline distT="0" distB="0" distL="0" distR="0" wp14:anchorId="3FF016A8" wp14:editId="78A1F402">
             <wp:extent cx="5038725" cy="3714750"/>
             <wp:effectExtent l="0" t="0" r="0" b="0"/>
-            <wp:docPr id="627784271" name="settings-about" descr="settings-about" title="settings-about"/>
+            <wp:docPr id="287495879" name="settings-about" descr="settings-about" title="settings-about"/>
             <wp:cNvGraphicFramePr>
               <a:graphicFrameLocks xmlns:a="http://schemas.openxmlformats.org/drawingml/2006/main" noChangeAspect="1"/>
             </wp:cNvGraphicFramePr>
@@ -19427,14 +19494,7 @@
         <w:spacing w:after="80"/>
       </w:pPr>
       <w:r>
-        <w:rPr>
-          <w:b/>
-          <w:bCs/>
-        </w:rPr>
-        <w:t>User manual (PDF and Word)</w:t>
-      </w:r>
-      <w:r>
-        <w:t xml:space="preserve"> opens the download location of this manual on GitHub.</w:t>
+        <w:t>Links to the source code, problem reports, the privacy statement and open-source licenses.</w:t>
       </w:r>
     </w:p>
     <w:p>
@@ -19447,19 +19507,6 @@
         <w:spacing w:after="80"/>
       </w:pPr>
       <w:r>
-        <w:t>Links to the source code, problem reports, the privacy statement and open-source licenses.</w:t>
-      </w:r>
-    </w:p>
-    <w:p>
-      <w:pPr>
-        <w:pStyle w:val="a4"/>
-        <w:numPr>
-          <w:ilvl w:val="0"/>
-          <w:numId w:val="2"/>
-        </w:numPr>
-        <w:spacing w:after="80"/>
-      </w:pPr>
-      <w:r>
         <w:rPr>
           <w:b/>
           <w:bCs/>
@@ -19502,7 +19549,7 @@
       <w:pPr>
         <w:pStyle w:val="1"/>
       </w:pPr>
-      <w:bookmarkStart w:id="51" w:name="_Toc242656189"/>
+      <w:bookmarkStart w:id="51" w:name="_Toc242660064"/>
       <w:r>
         <w:t>10 Updating and uninstalling</w:t>
       </w:r>
@@ -19512,7 +19559,7 @@
       <w:pPr>
         <w:pStyle w:val="2"/>
       </w:pPr>
-      <w:bookmarkStart w:id="52" w:name="_Toc242656190"/>
+      <w:bookmarkStart w:id="52" w:name="_Toc242660065"/>
       <w:r>
         <w:t>10.1 Checking for and installing updates</w:t>
       </w:r>
@@ -19564,10 +19611,10 @@
           <w:noProof/>
         </w:rPr>
         <w:drawing>
-          <wp:inline distT="0" distB="0" distL="0" distR="0" wp14:anchorId="20C789FD" wp14:editId="2205848E">
+          <wp:inline distT="0" distB="0" distL="0" distR="0" wp14:anchorId="781AEDC7" wp14:editId="3C20F1A4">
             <wp:extent cx="3600450" cy="1743075"/>
             <wp:effectExtent l="0" t="0" r="0" b="0"/>
-            <wp:docPr id="1444808758" name="message-update" descr="message-update" title="message-update"/>
+            <wp:docPr id="1960487754" name="message-update" descr="message-update" title="message-update"/>
             <wp:cNvGraphicFramePr>
               <a:graphicFrameLocks xmlns:a="http://schemas.openxmlformats.org/drawingml/2006/main" noChangeAspect="1"/>
             </wp:cNvGraphicFramePr>
@@ -19721,7 +19768,7 @@
       <w:pPr>
         <w:pStyle w:val="2"/>
       </w:pPr>
-      <w:bookmarkStart w:id="53" w:name="_Toc242656191"/>
+      <w:bookmarkStart w:id="53" w:name="_Toc242660066"/>
       <w:r>
         <w:t>10.2 Portable version</w:t>
       </w:r>
@@ -19749,7 +19796,7 @@
       <w:pPr>
         <w:pStyle w:val="2"/>
       </w:pPr>
-      <w:bookmarkStart w:id="54" w:name="_Toc242656192"/>
+      <w:bookmarkStart w:id="54" w:name="_Toc242660067"/>
       <w:r>
         <w:t>10.3 Uninstalling</w:t>
       </w:r>
@@ -19848,7 +19895,7 @@
       <w:pPr>
         <w:pStyle w:val="2"/>
       </w:pPr>
-      <w:bookmarkStart w:id="55" w:name="_Toc242656193"/>
+      <w:bookmarkStart w:id="55" w:name="_Toc242660068"/>
       <w:r>
         <w:t>10.4 Where settings and logs are stored</w:t>
       </w:r>
@@ -19870,7 +19917,7 @@
           <w:left w:w="10" w:type="dxa"/>
           <w:right w:w="10" w:type="dxa"/>
         </w:tblCellMar>
-        <w:tblLook w:val="0000" w:firstRow="0" w:lastRow="0" w:firstColumn="0" w:lastColumn="0" w:noHBand="0" w:noVBand="0"/>
+        <w:tblLook w:val="04A0" w:firstRow="1" w:lastRow="0" w:firstColumn="1" w:lastColumn="0" w:noHBand="0" w:noVBand="1"/>
       </w:tblPr>
       <w:tblGrid>
         <w:gridCol w:w="1674"/>
@@ -20234,7 +20281,7 @@
       <w:pPr>
         <w:pStyle w:val="1"/>
       </w:pPr>
-      <w:bookmarkStart w:id="56" w:name="_Toc242656194"/>
+      <w:bookmarkStart w:id="56" w:name="_Toc242660069"/>
       <w:r>
         <w:t>11 Troubleshooting</w:t>
       </w:r>
@@ -20702,6 +20749,56 @@
           <w:b/>
           <w:bCs/>
         </w:rPr>
+        <w:t>How do I open this manual again?</w:t>
+      </w:r>
+    </w:p>
+    <w:p>
+      <w:pPr>
+        <w:spacing w:after="120"/>
+        <w:ind w:left="440"/>
+      </w:pPr>
+      <w:r>
+        <w:t xml:space="preserve">Click the </w:t>
+      </w:r>
+      <w:r>
+        <w:rPr>
+          <w:b/>
+          <w:bCs/>
+        </w:rPr>
+        <w:t>?</w:t>
+      </w:r>
+      <w:r>
+        <w:t xml:space="preserve"> button (</w:t>
+      </w:r>
+      <w:r>
+        <w:rPr>
+          <w:b/>
+          <w:bCs/>
+        </w:rPr>
+        <w:t>User manual</w:t>
+      </w:r>
+      <w:r>
+        <w:t>) on the floating toolbar; the PDF edition on GitHub opens in a new browser tab. The Word and PDF files can also be downloaded from the GitHub release page.</w:t>
+      </w:r>
+    </w:p>
+    <w:p>
+      <w:pPr>
+        <w:keepNext/>
+        <w:spacing w:before="200" w:after="60"/>
+      </w:pPr>
+      <w:r>
+        <w:rPr>
+          <w:b/>
+          <w:bCs/>
+          <w:color w:val="1D4FFF"/>
+        </w:rPr>
+        <w:t>Q </w:t>
+      </w:r>
+      <w:r>
+        <w:rPr>
+          <w:b/>
+          <w:bCs/>
+        </w:rPr>
         <w:t>How do I report a problem?</w:t>
       </w:r>
     </w:p>
@@ -20756,7 +20853,7 @@
       <w:pPr>
         <w:pStyle w:val="1"/>
       </w:pPr>
-      <w:bookmarkStart w:id="57" w:name="_Toc242656195"/>
+      <w:bookmarkStart w:id="57" w:name="_Toc242660070"/>
       <w:r>
         <w:t>A Shortcuts and keys at a glance</w:t>
       </w:r>
@@ -20778,7 +20875,7 @@
           <w:left w:w="10" w:type="dxa"/>
           <w:right w:w="10" w:type="dxa"/>
         </w:tblCellMar>
-        <w:tblLook w:val="0000" w:firstRow="0" w:lastRow="0" w:firstColumn="0" w:lastColumn="0" w:noHBand="0" w:noVBand="0"/>
+        <w:tblLook w:val="04A0" w:firstRow="1" w:lastRow="0" w:firstColumn="1" w:lastColumn="0" w:noHBand="0" w:noVBand="1"/>
       </w:tblPr>
       <w:tblGrid>
         <w:gridCol w:w="2790"/>
@@ -21886,7 +21983,7 @@
       <w:pPr>
         <w:pStyle w:val="1"/>
       </w:pPr>
-      <w:bookmarkStart w:id="58" w:name="_Toc242656196"/>
+      <w:bookmarkStart w:id="58" w:name="_Toc242660071"/>
       <w:r>
         <w:t>B Supported codes</w:t>
       </w:r>
@@ -21908,7 +22005,7 @@
           <w:left w:w="10" w:type="dxa"/>
           <w:right w:w="10" w:type="dxa"/>
         </w:tblCellMar>
-        <w:tblLook w:val="0000" w:firstRow="0" w:lastRow="0" w:firstColumn="0" w:lastColumn="0" w:noHBand="0" w:noVBand="0"/>
+        <w:tblLook w:val="04A0" w:firstRow="1" w:lastRow="0" w:firstColumn="1" w:lastColumn="0" w:noHBand="0" w:noVBand="1"/>
       </w:tblPr>
       <w:tblGrid>
         <w:gridCol w:w="2789"/>
@@ -22122,7 +22219,7 @@
           <w:left w:w="10" w:type="dxa"/>
           <w:right w:w="10" w:type="dxa"/>
         </w:tblCellMar>
-        <w:tblLook w:val="0000" w:firstRow="0" w:lastRow="0" w:firstColumn="0" w:lastColumn="0" w:noHBand="0" w:noVBand="0"/>
+        <w:tblLook w:val="04A0" w:firstRow="1" w:lastRow="0" w:firstColumn="1" w:lastColumn="0" w:noHBand="0" w:noVBand="1"/>
       </w:tblPr>
       <w:tblGrid>
         <w:gridCol w:w="2789"/>
@@ -22883,7 +22980,7 @@
         </w:rPr>
         <w:lastRenderedPageBreak/>
         <w:drawing>
-          <wp:anchor distT="0" distB="0" distL="0" distR="0" simplePos="0" relativeHeight="251658240" behindDoc="1" locked="0" layoutInCell="1" allowOverlap="1" wp14:anchorId="48BB06AA" wp14:editId="49FB81BF">
+          <wp:anchor distT="0" distB="0" distL="0" distR="0" simplePos="0" relativeHeight="251658240" behindDoc="1" locked="0" layoutInCell="1" allowOverlap="1" wp14:anchorId="56E2EE47" wp14:editId="5ADC017E">
             <wp:simplePos x="0" y="0"/>
             <wp:positionH relativeFrom="page">
               <wp:posOffset>0</wp:posOffset>
@@ -22894,7 +22991,7 @@
             <wp:extent cx="7562850" cy="10696575"/>
             <wp:effectExtent l="0" t="0" r="0" b="0"/>
             <wp:wrapNone/>
-            <wp:docPr id="1178132778" name="back" descr="QRcode tool User Manual" title="back"/>
+            <wp:docPr id="1491580806" name="back" descr="QRcode tool User Manual" title="back"/>
             <wp:cNvGraphicFramePr>
               <a:graphicFrameLocks xmlns:a="http://schemas.openxmlformats.org/drawingml/2006/main" noChangeAspect="1"/>
             </wp:cNvGraphicFramePr>
@@ -23316,10 +23413,10 @@
 <file path=word/numbering.xml><?xml version="1.0" encoding="utf-8"?>
 <w:numbering xmlns:wpc="http://schemas.microsoft.com/office/word/2010/wordprocessingCanvas" xmlns:cx="http://schemas.microsoft.com/office/drawing/2014/chartex" xmlns:cx1="http://schemas.microsoft.com/office/drawing/2015/9/8/chartex" xmlns:cx2="http://schemas.microsoft.com/office/drawing/2015/10/21/chartex" xmlns:cx3="http://schemas.microsoft.com/office/drawing/2016/5/9/chartex" xmlns:cx4="http://schemas.microsoft.com/office/drawing/2016/5/10/chartex" xmlns:cx5="http://schemas.microsoft.com/office/drawing/2016/5/11/chartex" xmlns:cx6="http://schemas.microsoft.com/office/drawing/2016/5/12/chartex" xmlns:cx7="http://schemas.microsoft.com/office/drawing/2016/5/13/chartex" xmlns:cx8="http://schemas.microsoft.com/office/drawing/2016/5/14/chartex" xmlns:mc="http://schemas.openxmlformats.org/markup-compatibility/2006" xmlns:aink="http://schemas.microsoft.com/office/drawing/2016/ink" xmlns:am3d="http://schemas.microsoft.com/office/drawing/2017/model3d" xmlns:o="urn:schemas-microsoft-com:office:office" xmlns:oel="http://schemas.microsoft.com/office/2019/extlst" xmlns:r="http://schemas.openxmlformats.org/officeDocument/2006/relationships" xmlns:m="http://schemas.openxmlformats.org/officeDocument/2006/math" xmlns:v="urn:schemas-microsoft-com:vml" xmlns:wp14="http://schemas.microsoft.com/office/word/2010/wordprocessingDrawing" xmlns:wp="http://schemas.openxmlformats.org/drawingml/2006/wordprocessingDrawing" xmlns:w10="urn:schemas-microsoft-com:office:word" xmlns:w="http://schemas.openxmlformats.org/wordprocessingml/2006/main" xmlns:w14="http://schemas.microsoft.com/office/word/2010/wordml" xmlns:w15="http://schemas.microsoft.com/office/word/2012/wordml" xmlns:w16cex="http://schemas.microsoft.com/office/word/2018/wordml/cex" xmlns:w16cid="http://schemas.microsoft.com/office/word/2016/wordml/cid" xmlns:w16="http://schemas.microsoft.com/office/word/2018/wordml" xmlns:w16du="http://schemas.microsoft.com/office/word/2023/wordml/word16du" xmlns:w16sdtdh="http://schemas.microsoft.com/office/word/2020/wordml/sdtdatahash" xmlns:w16sdtfl="http://schemas.microsoft.com/office/word/2024/wordml/sdtformatlock" xmlns:w16se="http://schemas.microsoft.com/office/word/2015/wordml/symex" xmlns:wpg="http://schemas.microsoft.com/office/word/2010/wordprocessingGroup" xmlns:wpi="http://schemas.microsoft.com/office/word/2010/wordprocessingInk" xmlns:wne="http://schemas.microsoft.com/office/word/2006/wordml" xmlns:wps="http://schemas.microsoft.com/office/word/2010/wordprocessingShape" mc:Ignorable="w14 w15 w16se w16cid w16 w16cex w16sdtdh w16sdtfl w16du wp14">
   <w:abstractNum w:abstractNumId="0" w15:restartNumberingAfterBreak="0">
-    <w:nsid w:val="076E494A"/>
+    <w:nsid w:val="171C52F7"/>
     <w:multiLevelType w:val="hybridMultilevel"/>
-    <w:tmpl w:val="DFC62FF6"/>
-    <w:lvl w:ilvl="0" w:tplc="4AC0FC9E">
+    <w:tmpl w:val="4288D0B6"/>
+    <w:lvl w:ilvl="0" w:tplc="823E001C">
       <w:start w:val="1"/>
       <w:numFmt w:val="bullet"/>
       <w:lvlText w:val="●"/>
@@ -23328,7 +23425,7 @@
         <w:ind w:left="720" w:hanging="360"/>
       </w:pPr>
     </w:lvl>
-    <w:lvl w:ilvl="1" w:tplc="01241DEC">
+    <w:lvl w:ilvl="1" w:tplc="805251F0">
       <w:start w:val="1"/>
       <w:numFmt w:val="bullet"/>
       <w:lvlText w:val="○"/>
@@ -23337,7 +23434,7 @@
         <w:ind w:left="1440" w:hanging="360"/>
       </w:pPr>
     </w:lvl>
-    <w:lvl w:ilvl="2" w:tplc="6A444F6C">
+    <w:lvl w:ilvl="2" w:tplc="D602C0EE">
       <w:start w:val="1"/>
       <w:numFmt w:val="bullet"/>
       <w:lvlText w:val="■"/>
@@ -23346,7 +23443,7 @@
         <w:ind w:left="2160" w:hanging="360"/>
       </w:pPr>
     </w:lvl>
-    <w:lvl w:ilvl="3" w:tplc="35DA60A8">
+    <w:lvl w:ilvl="3" w:tplc="E19A8DAA">
       <w:start w:val="1"/>
       <w:numFmt w:val="bullet"/>
       <w:lvlText w:val="●"/>
@@ -23355,7 +23452,7 @@
         <w:ind w:left="2880" w:hanging="360"/>
       </w:pPr>
     </w:lvl>
-    <w:lvl w:ilvl="4" w:tplc="702E05AE">
+    <w:lvl w:ilvl="4" w:tplc="2FB6A3D4">
       <w:start w:val="1"/>
       <w:numFmt w:val="bullet"/>
       <w:lvlText w:val="○"/>
@@ -23364,7 +23461,7 @@
         <w:ind w:left="3600" w:hanging="360"/>
       </w:pPr>
     </w:lvl>
-    <w:lvl w:ilvl="5" w:tplc="4B30C928">
+    <w:lvl w:ilvl="5" w:tplc="8652877E">
       <w:start w:val="1"/>
       <w:numFmt w:val="bullet"/>
       <w:lvlText w:val="■"/>
@@ -23373,7 +23470,7 @@
         <w:ind w:left="4320" w:hanging="360"/>
       </w:pPr>
     </w:lvl>
-    <w:lvl w:ilvl="6" w:tplc="90800A02">
+    <w:lvl w:ilvl="6" w:tplc="4E94E52A">
       <w:start w:val="1"/>
       <w:numFmt w:val="bullet"/>
       <w:lvlText w:val="●"/>
@@ -23382,7 +23479,7 @@
         <w:ind w:left="5040" w:hanging="360"/>
       </w:pPr>
     </w:lvl>
-    <w:lvl w:ilvl="7" w:tplc="6602C5D0">
+    <w:lvl w:ilvl="7" w:tplc="F90278E6">
       <w:start w:val="1"/>
       <w:numFmt w:val="bullet"/>
       <w:lvlText w:val="●"/>
@@ -23391,7 +23488,7 @@
         <w:ind w:left="5760" w:hanging="360"/>
       </w:pPr>
     </w:lvl>
-    <w:lvl w:ilvl="8" w:tplc="74764B8A">
+    <w:lvl w:ilvl="8" w:tplc="81CCE5C4">
       <w:start w:val="1"/>
       <w:numFmt w:val="bullet"/>
       <w:lvlText w:val="●"/>
@@ -23402,10 +23499,10 @@
     </w:lvl>
   </w:abstractNum>
   <w:abstractNum w:abstractNumId="1" w15:restartNumberingAfterBreak="0">
-    <w:nsid w:val="10275EFF"/>
+    <w:nsid w:val="206612F6"/>
     <w:multiLevelType w:val="hybridMultilevel"/>
-    <w:tmpl w:val="2A7E7520"/>
-    <w:lvl w:ilvl="0" w:tplc="DA6C1D14">
+    <w:tmpl w:val="4ABA40F6"/>
+    <w:lvl w:ilvl="0" w:tplc="B04AB6C8">
       <w:start w:val="1"/>
       <w:numFmt w:val="decimal"/>
       <w:lvlText w:val="%1."/>
@@ -23419,52 +23516,52 @@
         <w:color w:val="1D4FFF"/>
       </w:rPr>
     </w:lvl>
-    <w:lvl w:ilvl="1" w:tplc="FC42F544">
+    <w:lvl w:ilvl="1" w:tplc="9F0ABB76">
       <w:numFmt w:val="decimal"/>
       <w:lvlText w:val=""/>
       <w:lvlJc w:val="left"/>
     </w:lvl>
-    <w:lvl w:ilvl="2" w:tplc="DA9C12FA">
+    <w:lvl w:ilvl="2" w:tplc="419A10E6">
       <w:numFmt w:val="decimal"/>
       <w:lvlText w:val=""/>
       <w:lvlJc w:val="left"/>
     </w:lvl>
-    <w:lvl w:ilvl="3" w:tplc="7F3CC8A6">
+    <w:lvl w:ilvl="3" w:tplc="CC98909E">
       <w:numFmt w:val="decimal"/>
       <w:lvlText w:val=""/>
       <w:lvlJc w:val="left"/>
     </w:lvl>
-    <w:lvl w:ilvl="4" w:tplc="43FCAFDA">
+    <w:lvl w:ilvl="4" w:tplc="A476B25E">
       <w:numFmt w:val="decimal"/>
       <w:lvlText w:val=""/>
       <w:lvlJc w:val="left"/>
     </w:lvl>
-    <w:lvl w:ilvl="5" w:tplc="F31E7B0A">
+    <w:lvl w:ilvl="5" w:tplc="3BB4C7C0">
       <w:numFmt w:val="decimal"/>
       <w:lvlText w:val=""/>
       <w:lvlJc w:val="left"/>
     </w:lvl>
-    <w:lvl w:ilvl="6" w:tplc="985EB76C">
+    <w:lvl w:ilvl="6" w:tplc="9A309D30">
       <w:numFmt w:val="decimal"/>
       <w:lvlText w:val=""/>
       <w:lvlJc w:val="left"/>
     </w:lvl>
-    <w:lvl w:ilvl="7" w:tplc="2234A6B0">
+    <w:lvl w:ilvl="7" w:tplc="C8AE4696">
       <w:numFmt w:val="decimal"/>
       <w:lvlText w:val=""/>
       <w:lvlJc w:val="left"/>
     </w:lvl>
-    <w:lvl w:ilvl="8" w:tplc="47448532">
+    <w:lvl w:ilvl="8" w:tplc="6C7C66CA">
       <w:numFmt w:val="decimal"/>
       <w:lvlText w:val=""/>
       <w:lvlJc w:val="left"/>
     </w:lvl>
   </w:abstractNum>
   <w:abstractNum w:abstractNumId="2" w15:restartNumberingAfterBreak="0">
-    <w:nsid w:val="66E40C85"/>
+    <w:nsid w:val="33586450"/>
     <w:multiLevelType w:val="hybridMultilevel"/>
-    <w:tmpl w:val="13589D6A"/>
-    <w:lvl w:ilvl="0" w:tplc="70A002B6">
+    <w:tmpl w:val="48A07E74"/>
+    <w:lvl w:ilvl="0" w:tplc="967EE69A">
       <w:start w:val="1"/>
       <w:numFmt w:val="bullet"/>
       <w:lvlText w:val="•"/>
@@ -23476,126 +23573,126 @@
         <w:color w:val="1D4FFF"/>
       </w:rPr>
     </w:lvl>
-    <w:lvl w:ilvl="1" w:tplc="5C3A89FA">
+    <w:lvl w:ilvl="1" w:tplc="385EC990">
       <w:numFmt w:val="decimal"/>
       <w:lvlText w:val=""/>
       <w:lvlJc w:val="left"/>
     </w:lvl>
-    <w:lvl w:ilvl="2" w:tplc="E7E26A60">
+    <w:lvl w:ilvl="2" w:tplc="37260390">
       <w:numFmt w:val="decimal"/>
       <w:lvlText w:val=""/>
       <w:lvlJc w:val="left"/>
     </w:lvl>
-    <w:lvl w:ilvl="3" w:tplc="47EEFA10">
+    <w:lvl w:ilvl="3" w:tplc="F39EB40A">
       <w:numFmt w:val="decimal"/>
       <w:lvlText w:val=""/>
       <w:lvlJc w:val="left"/>
     </w:lvl>
-    <w:lvl w:ilvl="4" w:tplc="0508633C">
+    <w:lvl w:ilvl="4" w:tplc="5900E1EE">
       <w:numFmt w:val="decimal"/>
       <w:lvlText w:val=""/>
       <w:lvlJc w:val="left"/>
     </w:lvl>
-    <w:lvl w:ilvl="5" w:tplc="78408F32">
+    <w:lvl w:ilvl="5" w:tplc="279CF534">
       <w:numFmt w:val="decimal"/>
       <w:lvlText w:val=""/>
       <w:lvlJc w:val="left"/>
     </w:lvl>
-    <w:lvl w:ilvl="6" w:tplc="F854566A">
+    <w:lvl w:ilvl="6" w:tplc="57D4DF5A">
       <w:numFmt w:val="decimal"/>
       <w:lvlText w:val=""/>
       <w:lvlJc w:val="left"/>
     </w:lvl>
-    <w:lvl w:ilvl="7" w:tplc="736A2BB6">
+    <w:lvl w:ilvl="7" w:tplc="2F0AE7D2">
       <w:numFmt w:val="decimal"/>
       <w:lvlText w:val=""/>
       <w:lvlJc w:val="left"/>
     </w:lvl>
-    <w:lvl w:ilvl="8" w:tplc="73E826D4">
+    <w:lvl w:ilvl="8" w:tplc="24D8BB02">
       <w:numFmt w:val="decimal"/>
       <w:lvlText w:val=""/>
       <w:lvlJc w:val="left"/>
     </w:lvl>
   </w:abstractNum>
-  <w:num w:numId="1" w16cid:durableId="1533111407">
+  <w:num w:numId="1" w16cid:durableId="1897008209">
     <w:abstractNumId w:val="0"/>
     <w:lvlOverride w:ilvl="0">
       <w:startOverride w:val="1"/>
     </w:lvlOverride>
   </w:num>
-  <w:num w:numId="2" w16cid:durableId="2025089146">
+  <w:num w:numId="2" w16cid:durableId="1666123718">
     <w:abstractNumId w:val="2"/>
     <w:lvlOverride w:ilvl="0">
       <w:startOverride w:val="1"/>
     </w:lvlOverride>
   </w:num>
-  <w:num w:numId="3" w16cid:durableId="1088504895">
+  <w:num w:numId="3" w16cid:durableId="1381829540">
     <w:abstractNumId w:val="1"/>
     <w:lvlOverride w:ilvl="0">
       <w:startOverride w:val="1"/>
     </w:lvlOverride>
   </w:num>
-  <w:num w:numId="4" w16cid:durableId="1823698515">
+  <w:num w:numId="4" w16cid:durableId="192306998">
     <w:abstractNumId w:val="1"/>
     <w:lvlOverride w:ilvl="0">
       <w:startOverride w:val="1"/>
     </w:lvlOverride>
   </w:num>
-  <w:num w:numId="5" w16cid:durableId="900215484">
+  <w:num w:numId="5" w16cid:durableId="126315807">
     <w:abstractNumId w:val="1"/>
     <w:lvlOverride w:ilvl="0">
       <w:startOverride w:val="1"/>
     </w:lvlOverride>
   </w:num>
-  <w:num w:numId="6" w16cid:durableId="1789204891">
+  <w:num w:numId="6" w16cid:durableId="802847107">
     <w:abstractNumId w:val="1"/>
     <w:lvlOverride w:ilvl="0">
       <w:startOverride w:val="1"/>
     </w:lvlOverride>
   </w:num>
-  <w:num w:numId="7" w16cid:durableId="1096904782">
+  <w:num w:numId="7" w16cid:durableId="1751388974">
     <w:abstractNumId w:val="1"/>
     <w:lvlOverride w:ilvl="0">
       <w:startOverride w:val="1"/>
     </w:lvlOverride>
   </w:num>
-  <w:num w:numId="8" w16cid:durableId="1388995259">
+  <w:num w:numId="8" w16cid:durableId="1125735393">
     <w:abstractNumId w:val="1"/>
     <w:lvlOverride w:ilvl="0">
       <w:startOverride w:val="1"/>
     </w:lvlOverride>
   </w:num>
-  <w:num w:numId="9" w16cid:durableId="2067408521">
+  <w:num w:numId="9" w16cid:durableId="1130825111">
     <w:abstractNumId w:val="1"/>
     <w:lvlOverride w:ilvl="0">
       <w:startOverride w:val="1"/>
     </w:lvlOverride>
   </w:num>
-  <w:num w:numId="10" w16cid:durableId="1775176480">
+  <w:num w:numId="10" w16cid:durableId="1726874540">
     <w:abstractNumId w:val="1"/>
     <w:lvlOverride w:ilvl="0">
       <w:startOverride w:val="1"/>
     </w:lvlOverride>
   </w:num>
-  <w:num w:numId="11" w16cid:durableId="38674550">
+  <w:num w:numId="11" w16cid:durableId="790244786">
     <w:abstractNumId w:val="1"/>
     <w:lvlOverride w:ilvl="0">
       <w:startOverride w:val="1"/>
     </w:lvlOverride>
   </w:num>
-  <w:num w:numId="12" w16cid:durableId="92213009">
+  <w:num w:numId="12" w16cid:durableId="1757432224">
     <w:abstractNumId w:val="1"/>
     <w:lvlOverride w:ilvl="0">
       <w:startOverride w:val="1"/>
     </w:lvlOverride>
   </w:num>
-  <w:num w:numId="13" w16cid:durableId="837379116">
+  <w:num w:numId="13" w16cid:durableId="1432124427">
     <w:abstractNumId w:val="1"/>
     <w:lvlOverride w:ilvl="0">
       <w:startOverride w:val="1"/>
     </w:lvlOverride>
   </w:num>
-  <w:num w:numId="14" w16cid:durableId="946741436">
+  <w:num w:numId="14" w16cid:durableId="973485827">
     <w:abstractNumId w:val="1"/>
     <w:lvlOverride w:ilvl="0">
       <w:startOverride w:val="1"/>
@@ -24223,7 +24320,7 @@
     <w:link w:val="aa"/>
     <w:uiPriority w:val="99"/>
     <w:unhideWhenUsed/>
-    <w:rsid w:val="0097472B"/>
+    <w:rsid w:val="00534550"/>
     <w:pPr>
       <w:tabs>
         <w:tab w:val="center" w:pos="4153"/>
@@ -24241,7 +24338,7 @@
     <w:basedOn w:val="a0"/>
     <w:link w:val="a9"/>
     <w:uiPriority w:val="99"/>
-    <w:rsid w:val="0097472B"/>
+    <w:rsid w:val="00534550"/>
     <w:rPr>
       <w:sz w:val="20"/>
       <w:szCs w:val="20"/>
@@ -24253,7 +24350,7 @@
     <w:link w:val="ac"/>
     <w:uiPriority w:val="99"/>
     <w:unhideWhenUsed/>
-    <w:rsid w:val="0097472B"/>
+    <w:rsid w:val="00534550"/>
     <w:pPr>
       <w:tabs>
         <w:tab w:val="center" w:pos="4153"/>
@@ -24271,7 +24368,7 @@
     <w:basedOn w:val="a0"/>
     <w:link w:val="ab"/>
     <w:uiPriority w:val="99"/>
-    <w:rsid w:val="0097472B"/>
+    <w:rsid w:val="00534550"/>
     <w:rPr>
       <w:sz w:val="20"/>
       <w:szCs w:val="20"/>

</xml_diff>